<commit_message>
Update course name and docs
</commit_message>
<xml_diff>
--- a/docs/02_design-brief.docx
+++ b/docs/02_design-brief.docx
@@ -4560,7 +4560,7 @@
         <w:color w:val="595959"/>
         <w:sz w:val="18"/>
       </w:rPr>
-      <w:t>종합설계</w:t>
+      <w:t xml:space="preserve">AI활용현업문제해결 </w:t>
     </w:r>
     <w:proofErr w:type="gramStart"/>
     <w:r>
@@ -4569,7 +4569,7 @@
         <w:color w:val="595959"/>
         <w:sz w:val="18"/>
       </w:rPr>
-      <w:t>2  ·</w:t>
+      <w:t>  ·</w:t>
     </w:r>
     <w:proofErr w:type="gramEnd"/>
     <w:r>

</xml_diff>

<commit_message>
docs: bring repo up to date with week 6 (README, forms 1-4, PDFs)
- README: reframe around the 10/7 problem definition — target (teens who
  have already lost money), concept 「멈칫」 with the two intervention
  moments and self-chosen strength, standalone-app deployment, dataset
  status as of 10/7, document table, week-by-week progress
- docs/02 design brief: replace with the 9/30 revision
- docs/03 problem list, docs/04 ideation report: add (9/30 versions)
- add LibreOffice-rendered PDFs for forms 1-4 for in-browser viewing

Co-Authored-By: Claude Fable 5.1 <noreply@anthropic.com>
</commit_message>
<xml_diff>
--- a/docs/02_design-brief.docx
+++ b/docs/02_design-brief.docx
@@ -1,6 +1,6 @@
 
 <file path=word/document.xml><?xml version="1.0" encoding="utf-8"?>
-<w:document xmlns:mc="http://schemas.openxmlformats.org/markup-compatibility/2006" xmlns:r="http://schemas.openxmlformats.org/officeDocument/2006/relationships" xmlns:w="http://schemas.openxmlformats.org/wordprocessingml/2006/main" xmlns:w14="http://schemas.microsoft.com/office/word/2010/wordml" mc:Ignorable="w14 w15 w16se w16cid w16 w16cex w16sdtdh wp14">
+<w:document xmlns:wpc="http://schemas.microsoft.com/office/word/2010/wordprocessingCanvas" xmlns:cx="http://schemas.microsoft.com/office/drawing/2014/chartex" xmlns:cx1="http://schemas.microsoft.com/office/drawing/2015/9/8/chartex" xmlns:cx2="http://schemas.microsoft.com/office/drawing/2015/10/21/chartex" xmlns:cx3="http://schemas.microsoft.com/office/drawing/2016/5/9/chartex" xmlns:cx4="http://schemas.microsoft.com/office/drawing/2016/5/10/chartex" xmlns:cx5="http://schemas.microsoft.com/office/drawing/2016/5/11/chartex" xmlns:cx6="http://schemas.microsoft.com/office/drawing/2016/5/12/chartex" xmlns:cx7="http://schemas.microsoft.com/office/drawing/2016/5/13/chartex" xmlns:cx8="http://schemas.microsoft.com/office/drawing/2016/5/14/chartex" xmlns:mc="http://schemas.openxmlformats.org/markup-compatibility/2006" xmlns:aink="http://schemas.microsoft.com/office/drawing/2016/ink" xmlns:am3d="http://schemas.microsoft.com/office/drawing/2017/model3d" xmlns:o="urn:schemas-microsoft-com:office:office" xmlns:oel="http://schemas.microsoft.com/office/2019/extlst" xmlns:r="http://schemas.openxmlformats.org/officeDocument/2006/relationships" xmlns:m="http://schemas.openxmlformats.org/officeDocument/2006/math" xmlns:v="urn:schemas-microsoft-com:vml" xmlns:wp14="http://schemas.microsoft.com/office/word/2010/wordprocessingDrawing" xmlns:wp="http://schemas.openxmlformats.org/drawingml/2006/wordprocessingDrawing" xmlns:w10="urn:schemas-microsoft-com:office:word" xmlns:w="http://schemas.openxmlformats.org/wordprocessingml/2006/main" xmlns:w14="http://schemas.microsoft.com/office/word/2010/wordml" xmlns:w15="http://schemas.microsoft.com/office/word/2012/wordml" xmlns:w16cex="http://schemas.microsoft.com/office/word/2018/wordml/cex" xmlns:w16cid="http://schemas.microsoft.com/office/word/2016/wordml/cid" xmlns:w16="http://schemas.microsoft.com/office/word/2018/wordml" xmlns:w16sdtdh="http://schemas.microsoft.com/office/word/2020/wordml/sdtdatahash" xmlns:w16se="http://schemas.microsoft.com/office/word/2015/wordml/symex" xmlns:wpg="http://schemas.microsoft.com/office/word/2010/wordprocessingGroup" xmlns:wpi="http://schemas.microsoft.com/office/word/2010/wordprocessingInk" xmlns:wne="http://schemas.microsoft.com/office/word/2006/wordml" xmlns:wps="http://schemas.microsoft.com/office/word/2010/wordprocessingShape" mc:Ignorable="w14 w15 w16se w16cid w16 w16cex w16sdtdh wp14">
   <w:body>
     <w:p>
       <w:pPr>
@@ -118,13 +118,11 @@
           <w:p>
             <w:pPr>
               <w:pStyle w:val="a3"/>
-              <w:spacing w:after="0" w:line="260" w:lineRule="auto"/>
-            </w:pPr>
-            <w:r>
-              <w:rPr>
-                <w:rFonts w:ascii="HY중고딕" w:eastAsia="HY중고딕" w:hAnsi="HY중고딕" w:cs="HY중고딕"/>
-                <w:sz w:val="20"/>
-                <w:szCs w:val="20"/>
+            </w:pPr>
+            <w:r>
+              <w:rPr>
+                <w:rFonts w:ascii="HY중고딕" w:eastAsia="HY중고딕" w:hAnsi="HY중고딕" w:cs="HY중고딕"/>
+                <w:sz w:val="22"/>
               </w:rPr>
               <w:t xml:space="preserve">화면 속 도박 콘텐츠 자동 탐지 서비스 — OCR·이미지 융합 기반 청소년 보호 솔루션</w:t>
             </w:r>
@@ -195,14 +193,11 @@
           <w:p>
             <w:pPr>
               <w:pStyle w:val="a3"/>
-              <w:ind w:left="22"/>
-              <w:spacing w:after="0" w:line="260" w:lineRule="auto"/>
-            </w:pPr>
-            <w:r>
-              <w:rPr>
-                <w:rFonts w:ascii="HY중고딕" w:eastAsia="HY중고딕" w:hAnsi="HY중고딕" w:cs="HY중고딕"/>
-                <w:sz w:val="20"/>
-                <w:szCs w:val="20"/>
+            </w:pPr>
+            <w:r>
+              <w:rPr>
+                <w:rFonts w:ascii="HY중고딕" w:eastAsia="HY중고딕" w:hAnsi="HY중고딕" w:cs="HY중고딕"/>
+                <w:sz w:val="22"/>
               </w:rPr>
               <w:t xml:space="preserve">개인 프로젝트 (1인)</w:t>
             </w:r>
@@ -242,14 +237,11 @@
           <w:p>
             <w:pPr>
               <w:pStyle w:val="a3"/>
-              <w:ind w:left="22"/>
-              <w:spacing w:after="0" w:line="260" w:lineRule="auto"/>
-            </w:pPr>
-            <w:r>
-              <w:rPr>
-                <w:rFonts w:ascii="HY중고딕" w:eastAsia="HY중고딕" w:hAnsi="HY중고딕" w:cs="HY중고딕"/>
-                <w:sz w:val="20"/>
-                <w:szCs w:val="20"/>
+            </w:pPr>
+            <w:r>
+              <w:rPr>
+                <w:rFonts w:ascii="HY중고딕" w:eastAsia="HY중고딕" w:hAnsi="HY중고딕" w:cs="HY중고딕" w:hint="eastAsia"/>
+                <w:sz w:val="22"/>
               </w:rPr>
               <w:t xml:space="preserve">김영국 교수   (서명)</w:t>
             </w:r>
@@ -289,14 +281,11 @@
           <w:p>
             <w:pPr>
               <w:pStyle w:val="a3"/>
-              <w:ind w:left="22"/>
-              <w:spacing w:after="0" w:line="260" w:lineRule="auto"/>
-            </w:pPr>
-            <w:r>
-              <w:rPr>
-                <w:rFonts w:ascii="HY중고딕" w:eastAsia="HY중고딕" w:hAnsi="HY중고딕" w:cs="HY중고딕"/>
-                <w:sz w:val="20"/>
-                <w:szCs w:val="20"/>
+            </w:pPr>
+            <w:r>
+              <w:rPr>
+                <w:rFonts w:ascii="HY중고딕" w:eastAsia="HY중고딕" w:hAnsi="HY중고딕" w:cs="HY중고딕"/>
+                <w:sz w:val="22"/>
               </w:rPr>
               <w:t xml:space="preserve">202650299 김성민</w:t>
             </w:r>
@@ -336,16 +325,13 @@
           <w:p>
             <w:pPr>
               <w:pStyle w:val="a3"/>
-              <w:ind w:left="22"/>
-              <w:spacing w:after="0" w:line="260" w:lineRule="auto"/>
-            </w:pPr>
-            <w:r>
-              <w:rPr>
-                <w:rFonts w:ascii="HY중고딕" w:eastAsia="HY중고딕" w:hAnsi="HY중고딕" w:cs="HY중고딕"/>
-                <w:sz w:val="20"/>
-                <w:szCs w:val="20"/>
-              </w:rPr>
-              <w:t xml:space="preserve">2026.  9.  15.</w:t>
+            </w:pPr>
+            <w:r>
+              <w:rPr>
+                <w:rFonts w:ascii="HY중고딕" w:eastAsia="HY중고딕" w:hAnsi="HY중고딕" w:cs="HY중고딕"/>
+                <w:sz w:val="22"/>
+              </w:rPr>
+              <w:t xml:space="preserve">2026. 9. 30.</w:t>
             </w:r>
           </w:p>
         </w:tc>
@@ -389,7 +375,7 @@
                 <w:rFonts w:ascii="HY중고딕" w:eastAsia="HY중고딕" w:hAnsi="HY중고딕" w:cs="HY중고딕"/>
                 <w:sz w:val="22"/>
               </w:rPr>
-              <w:t>https://github.com/Holy-Min/gambling-content-detection</w:t>
+              <w:t xml:space="preserve">https://github.com/Holy-Min/gambling-content-detection</w:t>
             </w:r>
           </w:p>
         </w:tc>
@@ -557,13 +543,12 @@
           <w:p>
             <w:pPr>
               <w:pStyle w:val="a3"/>
-              <w:spacing w:after="0" w:line="260" w:lineRule="auto"/>
-            </w:pPr>
-            <w:r>
-              <w:rPr>
-                <w:rFonts w:ascii="HY중고딕" w:eastAsia="HY중고딕" w:hAnsi="HY중고딕" w:cs="HY중고딕"/>
-                <w:sz w:val="20"/>
-                <w:szCs w:val="20"/>
+              <w:jc w:val="center"/>
+            </w:pPr>
+            <w:r>
+              <w:rPr>
+                <w:rFonts w:ascii="HY중고딕" w:eastAsia="HY중고딕" w:hAnsi="HY중고딕" w:cs="HY중고딕"/>
+                <w:sz w:val="22"/>
               </w:rPr>
               <w:t xml:space="preserve">2026/09/15</w:t>
             </w:r>
@@ -583,7 +568,7 @@
                 <w:rFonts w:ascii="HY중고딕" w:eastAsia="HY중고딕" w:hAnsi="HY중고딕" w:cs="HY중고딕"/>
                 <w:sz w:val="22"/>
               </w:rPr>
-              <w:t>최초 작성</w:t>
+              <w:t xml:space="preserve">최초 작성 (1~5번)</w:t>
             </w:r>
           </w:p>
         </w:tc>
@@ -595,13 +580,12 @@
           <w:p>
             <w:pPr>
               <w:pStyle w:val="a3"/>
-              <w:spacing w:after="0" w:line="260" w:lineRule="auto"/>
-            </w:pPr>
-            <w:r>
-              <w:rPr>
-                <w:rFonts w:ascii="HY중고딕" w:eastAsia="HY중고딕" w:hAnsi="HY중고딕" w:cs="HY중고딕"/>
-                <w:sz w:val="20"/>
-                <w:szCs w:val="20"/>
+              <w:jc w:val="center"/>
+            </w:pPr>
+            <w:r>
+              <w:rPr>
+                <w:rFonts w:ascii="HY중고딕" w:eastAsia="HY중고딕" w:hAnsi="HY중고딕" w:cs="HY중고딕"/>
+                <w:sz w:val="22"/>
               </w:rPr>
               <w:t xml:space="preserve">김성민</w:t>
             </w:r>
@@ -616,25 +600,72 @@
           <w:tcPr>
             <w:tcW w:w="900" w:type="dxa"/>
           </w:tcPr>
-          <w:p/>
+          <w:p>
+            <w:pPr>
+              <w:pStyle w:val="a3"/>
+              <w:jc w:val="center"/>
+            </w:pPr>
+            <w:r>
+              <w:rPr>
+                <w:rFonts w:ascii="HY중고딕" w:eastAsia="HY중고딕" w:hAnsi="HY중고딕" w:cs="HY중고딕"/>
+                <w:sz w:val="22"/>
+              </w:rPr>
+              <w:t xml:space="preserve">2</w:t>
+            </w:r>
+          </w:p>
         </w:tc>
         <w:tc>
           <w:tcPr>
             <w:tcW w:w="1700" w:type="dxa"/>
           </w:tcPr>
-          <w:p/>
+          <w:p>
+            <w:pPr>
+              <w:pStyle w:val="a3"/>
+              <w:jc w:val="center"/>
+            </w:pPr>
+            <w:r>
+              <w:rPr>
+                <w:rFonts w:ascii="HY중고딕" w:eastAsia="HY중고딕" w:hAnsi="HY중고딕" w:cs="HY중고딕"/>
+                <w:sz w:val="22"/>
+              </w:rPr>
+              <w:t xml:space="preserve">2026/09/23</w:t>
+            </w:r>
+          </w:p>
         </w:tc>
         <w:tc>
           <w:tcPr>
             <w:tcW w:w="5558" w:type="dxa"/>
           </w:tcPr>
-          <w:p/>
+          <w:p>
+            <w:pPr>
+              <w:pStyle w:val="a3"/>
+            </w:pPr>
+            <w:r>
+              <w:rPr>
+                <w:rFonts w:ascii="HY중고딕" w:eastAsia="HY중고딕" w:hAnsi="HY중고딕" w:cs="HY중고딕"/>
+                <w:sz w:val="22"/>
+              </w:rPr>
+              <w:t xml:space="preserve">6·7번 추가, 신규 양식 반영, 과목명 통일</w:t>
+            </w:r>
+          </w:p>
         </w:tc>
         <w:tc>
           <w:tcPr>
             <w:tcW w:w="2000" w:type="dxa"/>
           </w:tcPr>
-          <w:p/>
+          <w:p>
+            <w:pPr>
+              <w:pStyle w:val="a3"/>
+              <w:jc w:val="center"/>
+            </w:pPr>
+            <w:r>
+              <w:rPr>
+                <w:rFonts w:ascii="HY중고딕" w:eastAsia="HY중고딕" w:hAnsi="HY중고딕" w:cs="HY중고딕"/>
+                <w:sz w:val="22"/>
+              </w:rPr>
+              <w:t xml:space="preserve">김성민</w:t>
+            </w:r>
+          </w:p>
         </w:tc>
       </w:tr>
       <w:tr>
@@ -645,25 +676,72 @@
           <w:tcPr>
             <w:tcW w:w="900" w:type="dxa"/>
           </w:tcPr>
-          <w:p/>
+          <w:p>
+            <w:pPr>
+              <w:pStyle w:val="a3"/>
+              <w:jc w:val="center"/>
+            </w:pPr>
+            <w:r>
+              <w:rPr>
+                <w:rFonts w:ascii="HY중고딕" w:eastAsia="HY중고딕" w:hAnsi="HY중고딕" w:cs="HY중고딕"/>
+                <w:sz w:val="22"/>
+              </w:rPr>
+              <w:t xml:space="preserve">3</w:t>
+            </w:r>
+          </w:p>
         </w:tc>
         <w:tc>
           <w:tcPr>
             <w:tcW w:w="1700" w:type="dxa"/>
           </w:tcPr>
-          <w:p/>
+          <w:p>
+            <w:pPr>
+              <w:pStyle w:val="a3"/>
+              <w:jc w:val="center"/>
+            </w:pPr>
+            <w:r>
+              <w:rPr>
+                <w:rFonts w:ascii="HY중고딕" w:eastAsia="HY중고딕" w:hAnsi="HY중고딕" w:cs="HY중고딕"/>
+                <w:sz w:val="22"/>
+              </w:rPr>
+              <w:t xml:space="preserve">2026/09/30</w:t>
+            </w:r>
+          </w:p>
         </w:tc>
         <w:tc>
           <w:tcPr>
             <w:tcW w:w="5558" w:type="dxa"/>
           </w:tcPr>
-          <w:p/>
+          <w:p>
+            <w:pPr>
+              <w:pStyle w:val="a3"/>
+            </w:pPr>
+            <w:r>
+              <w:rPr>
+                <w:rFonts w:ascii="HY중고딕" w:eastAsia="HY중고딕" w:hAnsi="HY중고딕" w:cs="HY중고딕"/>
+                <w:sz w:val="22"/>
+              </w:rPr>
+              <w:t xml:space="preserve">2번 고객 세분화·핵심 타깃, 3~5번 수용성·정상 게임 구분, 6번 2단계 개입·지표 구체화, 8번 공감 계획 작성</w:t>
+            </w:r>
+          </w:p>
         </w:tc>
         <w:tc>
           <w:tcPr>
             <w:tcW w:w="2000" w:type="dxa"/>
           </w:tcPr>
-          <w:p/>
+          <w:p>
+            <w:pPr>
+              <w:pStyle w:val="a3"/>
+              <w:jc w:val="center"/>
+            </w:pPr>
+            <w:r>
+              <w:rPr>
+                <w:rFonts w:ascii="HY중고딕" w:eastAsia="HY중고딕" w:hAnsi="HY중고딕" w:cs="HY중고딕"/>
+                <w:sz w:val="22"/>
+              </w:rPr>
+              <w:t xml:space="preserve">김성민</w:t>
+            </w:r>
+          </w:p>
         </w:tc>
       </w:tr>
       <w:tr>
@@ -778,29 +856,20 @@
           <w:p>
             <w:pPr>
               <w:pStyle w:val="a3"/>
-              <w:spacing w:after="0" w:line="260" w:lineRule="auto"/>
+              <w:spacing w:after="80"/>
             </w:pPr>
             <w:r>
               <w:rPr>
                 <w:rFonts w:ascii="HY중고딕" w:eastAsia="HY중고딕" w:hAnsi="HY중고딕" w:cs="HY중고딕"/>
                 <w:b/>
                 <w:sz w:val="20"/>
-                <w:szCs w:val="20"/>
-              </w:rPr>
-              <w:t xml:space="preserve">■ 프로젝트 제목</w:t>
-            </w:r>
-          </w:p>
-          <w:p>
-            <w:pPr>
-              <w:pStyle w:val="a3"/>
-              <w:ind w:left="200"/>
-              <w:spacing w:after="0" w:line="260" w:lineRule="auto"/>
-            </w:pPr>
-            <w:r>
-              <w:rPr>
-                <w:rFonts w:ascii="HY중고딕" w:eastAsia="HY중고딕" w:hAnsi="HY중고딕" w:cs="HY중고딕"/>
-                <w:sz w:val="20"/>
-                <w:szCs w:val="20"/>
+              </w:rPr>
+              <w:t xml:space="preserve">프로젝트 제목: </w:t>
+            </w:r>
+            <w:r>
+              <w:rPr>
+                <w:rFonts w:ascii="HY중고딕" w:eastAsia="HY중고딕" w:hAnsi="HY중고딕" w:cs="HY중고딕"/>
+                <w:sz w:val="20"/>
               </w:rPr>
               <w:t xml:space="preserve">화면 속 도박 콘텐츠 자동 탐지 서비스 — OCR·이미지 융합 기반 청소년 보호 솔루션</w:t>
             </w:r>
@@ -808,148 +877,114 @@
           <w:p>
             <w:pPr>
               <w:pStyle w:val="a3"/>
-              <w:spacing w:after="0" w:line="260" w:lineRule="auto"/>
-            </w:pPr>
-          </w:p>
-          <w:p>
-            <w:pPr>
-              <w:pStyle w:val="a3"/>
-              <w:spacing w:after="0" w:line="260" w:lineRule="auto"/>
             </w:pPr>
             <w:r>
               <w:rPr>
                 <w:rFonts w:ascii="HY중고딕" w:eastAsia="HY중고딕" w:hAnsi="HY중고딕" w:cs="HY중고딕"/>
                 <w:b/>
                 <w:sz w:val="20"/>
-                <w:szCs w:val="20"/>
-              </w:rPr>
-              <w:t xml:space="preserve">■ 선정 배경</w:t>
-            </w:r>
-          </w:p>
-          <w:p>
-            <w:pPr>
-              <w:pStyle w:val="a3"/>
-              <w:ind w:left="200"/>
-              <w:spacing w:after="0" w:line="260" w:lineRule="auto"/>
-            </w:pPr>
-            <w:r>
-              <w:rPr>
-                <w:rFonts w:ascii="HY중고딕" w:eastAsia="HY중고딕" w:hAnsi="HY중고딕" w:cs="HY중고딕"/>
-                <w:sz w:val="20"/>
-                <w:szCs w:val="20"/>
-              </w:rPr>
-              <w:t xml:space="preserve">‣ 사행산업통합감독위원회 제5차 불법도박 실태조사에 따르면 국내 불법도박 시장 규모는 102조 7천억 원으로, 합법 사행산업 매출 총액의 4.48배에 달한다.</w:t>
-            </w:r>
-          </w:p>
-          <w:p>
-            <w:pPr>
-              <w:pStyle w:val="a3"/>
-              <w:ind w:left="200"/>
-              <w:spacing w:after="0" w:line="260" w:lineRule="auto"/>
-            </w:pPr>
-            <w:r>
-              <w:rPr>
-                <w:rFonts w:ascii="HY중고딕" w:eastAsia="HY중고딕" w:hAnsi="HY중고딕" w:cs="HY중고딕"/>
-                <w:sz w:val="20"/>
-                <w:szCs w:val="20"/>
-              </w:rPr>
-              <w:t xml:space="preserve">‣ 한국도박문제예방치유원 「2024년 청소년 도박 실태조사」(통계청 승인 제469001호)에서 초등학교 4학년~고등학교 3학년 재학생 약 390만 명의 4.3%가 1회 이상 도박을 경험한 것으로 나타났다.</w:t>
-            </w:r>
-          </w:p>
-          <w:p>
-            <w:pPr>
-              <w:pStyle w:val="a3"/>
-              <w:ind w:left="200"/>
-              <w:spacing w:after="0" w:line="260" w:lineRule="auto"/>
-            </w:pPr>
-            <w:r>
-              <w:rPr>
-                <w:rFonts w:ascii="HY중고딕" w:eastAsia="HY중고딕" w:hAnsi="HY중고딕" w:cs="HY중고딕"/>
-                <w:sz w:val="20"/>
-                <w:szCs w:val="20"/>
-              </w:rPr>
-              <w:t xml:space="preserve">‣ 도박 경험 청소년의 치유·상담 건수는 2020년 1,286명에서 2023년 2,093명으로 증가했으며, 유형별로는 온라인 카지노 불법도박이 59.0%로 가장 높고 2020년 대비 이용자 수가 14배 늘었다.</w:t>
-            </w:r>
-          </w:p>
-          <w:p>
-            <w:pPr>
-              <w:pStyle w:val="a3"/>
-              <w:ind w:left="200"/>
-              <w:spacing w:after="0" w:line="260" w:lineRule="auto"/>
-            </w:pPr>
-            <w:r>
-              <w:rPr>
-                <w:rFonts w:ascii="HY중고딕" w:eastAsia="HY중고딕" w:hAnsi="HY중고딕" w:cs="HY중고딕"/>
-                <w:sz w:val="20"/>
-                <w:szCs w:val="20"/>
-              </w:rPr>
-              <w:t xml:space="preserve">‣ 국방부 군 불법도박 실태조사의 심층조사 대상 장병 중 80%는 입대·임관 전부터 이미 불법도박을 경험한 것으로 파악되어, 청소년기의 최초 노출이 성인기 피해로 이어지고 있음을 보여준다.</w:t>
-            </w:r>
-          </w:p>
-          <w:p>
-            <w:pPr>
-              <w:pStyle w:val="a3"/>
-              <w:spacing w:after="0" w:line="260" w:lineRule="auto"/>
-            </w:pPr>
-          </w:p>
-          <w:p>
-            <w:pPr>
-              <w:pStyle w:val="a3"/>
-              <w:spacing w:after="0" w:line="260" w:lineRule="auto"/>
-            </w:pPr>
-            <w:r>
-              <w:rPr>
-                <w:rFonts w:ascii="HY중고딕" w:eastAsia="HY중고딕" w:hAnsi="HY중고딕" w:cs="HY중고딕"/>
-                <w:b/>
-                <w:sz w:val="20"/>
-                <w:szCs w:val="20"/>
-              </w:rPr>
-              <w:t xml:space="preserve">■ 필요성</w:t>
-            </w:r>
-          </w:p>
-          <w:p>
-            <w:pPr>
-              <w:pStyle w:val="a3"/>
-              <w:ind w:left="200"/>
-              <w:spacing w:after="0" w:line="260" w:lineRule="auto"/>
-            </w:pPr>
-            <w:r>
-              <w:rPr>
-                <w:rFonts w:ascii="HY중고딕" w:eastAsia="HY중고딕" w:hAnsi="HY중고딕" w:cs="HY중고딕"/>
-                <w:sz w:val="20"/>
-                <w:szCs w:val="20"/>
-              </w:rPr>
-              <w:t xml:space="preserve">‣ 현행 대응은 URL·도메인 단위 차단에 의존하므로, 운영자가 도메인을 교체하면 즉시 무력화된다.</w:t>
-            </w:r>
-          </w:p>
-          <w:p>
-            <w:pPr>
-              <w:pStyle w:val="a3"/>
-              <w:ind w:left="200"/>
-              <w:spacing w:after="0" w:line="260" w:lineRule="auto"/>
-            </w:pPr>
-            <w:r>
-              <w:rPr>
-                <w:rFonts w:ascii="HY중고딕" w:eastAsia="HY중고딕" w:hAnsi="HY중고딕" w:cs="HY중고딕"/>
-                <w:sz w:val="20"/>
-                <w:szCs w:val="20"/>
-              </w:rPr>
-              <w:t xml:space="preserve">‣ 무료 스포츠 중계·웹툰 사이트처럼 겉보기에 정상인 서비스 화면에 삽입된 도박 광고는 사이트 단위 차단으로 걸러지지 않는다.</w:t>
-            </w:r>
-          </w:p>
-          <w:p>
-            <w:pPr>
-              <w:pStyle w:val="a3"/>
-              <w:ind w:left="200"/>
-              <w:spacing w:after="0" w:line="260" w:lineRule="auto"/>
-            </w:pPr>
-            <w:r>
-              <w:rPr>
-                <w:rFonts w:ascii="HY중고딕" w:eastAsia="HY중고딕" w:hAnsi="HY중고딕" w:cs="HY중고딕"/>
-                <w:sz w:val="20"/>
-                <w:szCs w:val="20"/>
-              </w:rPr>
-              <w:t xml:space="preserve">‣ 따라서 주소가 아니라 사용자가 실제로 보는 화면 자체를 판정하는 탐지 방식이 필요하다.</w:t>
+              </w:rPr>
+              <w:t xml:space="preserve">선정 배경</w:t>
+            </w:r>
+          </w:p>
+          <w:p>
+            <w:pPr>
+              <w:pStyle w:val="a3"/>
+              <w:ind w:left="240" w:hanging="240"/>
+            </w:pPr>
+            <w:r>
+              <w:rPr>
+                <w:rFonts w:ascii="HY중고딕" w:eastAsia="HY중고딕" w:hAnsi="HY중고딕" w:cs="HY중고딕"/>
+                <w:sz w:val="20"/>
+              </w:rPr>
+              <w:t xml:space="preserve">‣ </w:t>
+            </w:r>
+            <w:r>
+              <w:rPr>
+                <w:rFonts w:ascii="HY중고딕" w:eastAsia="HY중고딕" w:hAnsi="HY중고딕" w:cs="HY중고딕"/>
+                <w:sz w:val="20"/>
+              </w:rPr>
+              <w:t xml:space="preserve">불법도박 시장은 사행산업통합감독위원회(사감위) 제5차 불법도박 실태조사 기준 총매출 약 102조 7천억 원으로, 합법 사행산업 매출(약 25조 3천억 원)의 4.48배에 이르며 2019년 제4차 조사(81조 5천억 원)보다 약 21조 원 늘었다.</w:t>
+            </w:r>
+          </w:p>
+          <w:p>
+            <w:pPr>
+              <w:pStyle w:val="a3"/>
+              <w:ind w:left="240" w:hanging="240"/>
+            </w:pPr>
+            <w:r>
+              <w:rPr>
+                <w:rFonts w:ascii="HY중고딕" w:eastAsia="HY중고딕" w:hAnsi="HY중고딕" w:cs="HY중고딕"/>
+                <w:sz w:val="20"/>
+              </w:rPr>
+              <w:t xml:space="preserve">‣ </w:t>
+            </w:r>
+            <w:r>
+              <w:rPr>
+                <w:rFonts w:ascii="HY중고딕" w:eastAsia="HY중고딕" w:hAnsi="HY중고딕" w:cs="HY중고딕"/>
+                <w:sz w:val="20"/>
+              </w:rPr>
+              <w:t xml:space="preserve">2024년 청소년 도박 실태조사(국가승인통계 제469001호, 605개교 13,368명)에서 초4~고3 재학생의 4.3%가 도박을 경험했고, 한국도박문제예방치유원의 청소년 상담 수요는 2020년 1,286명에서 2024년 8월 기준 2,665명으로 급증했다. 2026년 청소년 사이버도박 자진신고제 운영 결과 신고자 1,777명의 평균 연령은 15.5세, 평균 도박 기간 10개월, 평균 도박 금액 300만 원이었고 유형은 슬롯·바카라 등 카지노형이 95.9%였다.</w:t>
+            </w:r>
+          </w:p>
+          <w:p>
+            <w:pPr>
+              <w:pStyle w:val="a3"/>
+              <w:ind w:left="240" w:hanging="240"/>
+            </w:pPr>
+            <w:r>
+              <w:rPr>
+                <w:rFonts w:ascii="HY중고딕" w:eastAsia="HY중고딕" w:hAnsi="HY중고딕" w:cs="HY중고딕"/>
+                <w:sz w:val="20"/>
+              </w:rPr>
+              <w:t xml:space="preserve">‣ </w:t>
+            </w:r>
+            <w:r>
+              <w:rPr>
+                <w:rFonts w:ascii="HY중고딕" w:eastAsia="HY중고딕" w:hAnsi="HY중고딕" w:cs="HY중고딕"/>
+                <w:sz w:val="20"/>
+              </w:rPr>
+              <w:t xml:space="preserve">국방부 불법도박 실태조사 심층조사 대상 장병의 80%가 입대 전부터 불법도박을 경험한 것으로 나타나, 청소년기 노출이 성인기 피해로 이어지는 구조가 확인된다. 개입은 이를수록 효과가 크다.</w:t>
+            </w:r>
+          </w:p>
+          <w:p>
+            <w:pPr>
+              <w:pStyle w:val="a3"/>
+              <w:ind w:left="240" w:hanging="240"/>
+            </w:pPr>
+            <w:r>
+              <w:rPr>
+                <w:rFonts w:ascii="HY중고딕" w:eastAsia="HY중고딕" w:hAnsi="HY중고딕" w:cs="HY중고딕"/>
+                <w:sz w:val="20"/>
+              </w:rPr>
+              <w:t xml:space="preserve">‣ </w:t>
+            </w:r>
+            <w:r>
+              <w:rPr>
+                <w:rFonts w:ascii="HY중고딕" w:eastAsia="HY중고딕" w:hAnsi="HY중고딕" w:cs="HY중고딕"/>
+                <w:sz w:val="20"/>
+              </w:rPr>
+              <w:t xml:space="preserve">현행 대응은 URL·도메인 기준의 사후 차단이라 사이트가 주소를 바꾸면 무력화되고, 무료 스포츠 중계·웹툰·스트리밍 같은 정상 서비스 화면에 삽입된 도박 배너·광고는 아예 잡히지 않는다. 방송통신심의위원회 심의는 2025년 6~9월 사이 12만 7,769건이 적체됐고 그중 도박이 4만 9,961건으로 가장 많았다.</w:t>
+            </w:r>
+          </w:p>
+          <w:p>
+            <w:pPr>
+              <w:pStyle w:val="a3"/>
+              <w:ind w:left="240" w:hanging="240"/>
+            </w:pPr>
+            <w:r>
+              <w:rPr>
+                <w:rFonts w:ascii="HY중고딕" w:eastAsia="HY중고딕" w:hAnsi="HY중고딕" w:cs="HY중고딕"/>
+                <w:sz w:val="20"/>
+              </w:rPr>
+              <w:t xml:space="preserve">‣ </w:t>
+            </w:r>
+            <w:r>
+              <w:rPr>
+                <w:rFonts w:ascii="HY중고딕" w:eastAsia="HY중고딕" w:hAnsi="HY중고딕" w:cs="HY중고딕"/>
+                <w:sz w:val="20"/>
+              </w:rPr>
+              <w:t xml:space="preserve">결국 "청소년이 도박 콘텐츠에 노출되는 그 순간"에 작동하는 보호 수단이 비어 있다. 본 프로젝트는 사이트 주소가 아니라 화면 자체를 보고 도박 콘텐츠를 알려주는 청소년 보호 서비스를 설계한다.</w:t>
             </w:r>
           </w:p>
         </w:tc>
@@ -1002,154 +1037,99 @@
           <w:p>
             <w:pPr>
               <w:pStyle w:val="a3"/>
-              <w:spacing w:after="0" w:line="260" w:lineRule="auto"/>
+              <w:spacing w:after="80"/>
             </w:pPr>
             <w:r>
               <w:rPr>
                 <w:rFonts w:ascii="HY중고딕" w:eastAsia="HY중고딕" w:hAnsi="HY중고딕" w:cs="HY중고딕"/>
                 <w:b/>
                 <w:sz w:val="20"/>
-                <w:szCs w:val="20"/>
-              </w:rPr>
-              <w:t xml:space="preserve">■ 1차 사용자 (탐지 결과를 직접 제공받는 대상)</w:t>
-            </w:r>
-          </w:p>
-          <w:p>
-            <w:pPr>
-              <w:pStyle w:val="a3"/>
-              <w:ind w:left="200"/>
-              <w:spacing w:after="0" w:line="260" w:lineRule="auto"/>
-            </w:pPr>
-            <w:r>
-              <w:rPr>
-                <w:rFonts w:ascii="HY중고딕" w:eastAsia="HY중고딕" w:hAnsi="HY중고딕" w:cs="HY중고딕"/>
-                <w:sz w:val="20"/>
-                <w:szCs w:val="20"/>
-              </w:rPr>
-              <w:t xml:space="preserve">‣ 무료 스포츠 중계·웹툰·불법 스트리밍 사이트를 자주 이용하는 중·고등학생</w:t>
-            </w:r>
-          </w:p>
-          <w:p>
-            <w:pPr>
-              <w:pStyle w:val="a3"/>
-              <w:spacing w:after="0" w:line="260" w:lineRule="auto"/>
-            </w:pPr>
-          </w:p>
-          <w:p>
-            <w:pPr>
-              <w:pStyle w:val="a3"/>
-              <w:spacing w:after="0" w:line="260" w:lineRule="auto"/>
-            </w:pPr>
+              </w:rPr>
+              <w:t xml:space="preserve">◦ 1차 고객(구매·설치 결정자): 중·고생 자녀를 둔 보호자.</w:t>
+            </w:r>
+            <w:r>
+              <w:rPr>
+                <w:rFonts w:ascii="HY중고딕" w:eastAsia="HY중고딕" w:hAnsi="HY중고딕" w:cs="HY중고딕"/>
+                <w:sz w:val="20"/>
+              </w:rPr>
+              <w:t xml:space="preserve"> 세 집단으로 나누고 ⓑ를 핵심 타깃으로 잡는다. ⓐ 예방형 — 자녀에게 징후가 없고 관심도 낮다(정보 제공 대상). </w:t>
+            </w:r>
             <w:r>
               <w:rPr>
                 <w:rFonts w:ascii="HY중고딕" w:eastAsia="HY중고딕" w:hAnsi="HY중고딕" w:cs="HY중고딕"/>
                 <w:b/>
                 <w:sz w:val="20"/>
-                <w:szCs w:val="20"/>
-              </w:rPr>
-              <w:t xml:space="preserve">■ 보호자 · 관리자 (도입을 결정하고 결과를 활용하는 대상)</w:t>
-            </w:r>
-          </w:p>
-          <w:p>
-            <w:pPr>
-              <w:pStyle w:val="a3"/>
-              <w:ind w:left="200"/>
-              <w:spacing w:after="0" w:line="260" w:lineRule="auto"/>
-            </w:pPr>
-            <w:r>
-              <w:rPr>
-                <w:rFonts w:ascii="HY중고딕" w:eastAsia="HY중고딕" w:hAnsi="HY중고딕" w:cs="HY중고딕"/>
-                <w:sz w:val="20"/>
-                <w:szCs w:val="20"/>
-              </w:rPr>
-              <w:t xml:space="preserve">‣ 자녀의 스마트폰 이용을 관리하고 싶으나 구체적 방법을 알지 못하는 학부모</w:t>
-            </w:r>
-          </w:p>
-          <w:p>
-            <w:pPr>
-              <w:pStyle w:val="a3"/>
-              <w:ind w:left="200"/>
-              <w:spacing w:after="0" w:line="260" w:lineRule="auto"/>
-            </w:pPr>
-            <w:r>
-              <w:rPr>
-                <w:rFonts w:ascii="HY중고딕" w:eastAsia="HY중고딕" w:hAnsi="HY중고딕" w:cs="HY중고딕"/>
-                <w:sz w:val="20"/>
-                <w:szCs w:val="20"/>
-              </w:rPr>
-              <w:t xml:space="preserve">‣ 학교 Wee클래스 상담교사 — 학생의 도박 문제를 조기에 인지해야 하는 위치</w:t>
-            </w:r>
-          </w:p>
-          <w:p>
-            <w:pPr>
-              <w:pStyle w:val="a3"/>
-              <w:spacing w:after="0" w:line="260" w:lineRule="auto"/>
-            </w:pPr>
-          </w:p>
-          <w:p>
-            <w:pPr>
-              <w:pStyle w:val="a3"/>
-              <w:spacing w:after="0" w:line="260" w:lineRule="auto"/>
+              </w:rPr>
+              <w:t xml:space="preserve">ⓑ 징후 인지형(핵심 타깃)</w:t>
+            </w:r>
+            <w:r>
+              <w:rPr>
+                <w:rFonts w:ascii="HY중고딕" w:eastAsia="HY중고딕" w:hAnsi="HY중고딕" w:cs="HY중고딕"/>
+                <w:sz w:val="20"/>
+              </w:rPr>
+              <w:t xml:space="preserve"> — 자녀가 무료 스포츠 중계·단톡방 링크를 자주 보고 소액결제·문화상품권 구매가 늘어난 것을 알아채, 통신사 자녀안심 앱을 깔아 봤지만 뚫리거나 자녀와 싸움으로 끝난 경험이 있는 보호자. ⓒ 피해 발생형 — 이미 충전·빚이 생겨 상담(1336)·자진신고제와 연결돼야 하는 보호자(2차 확장 범위).</w:t>
+            </w:r>
+          </w:p>
+          <w:p>
+            <w:pPr>
+              <w:pStyle w:val="a3"/>
+              <w:spacing w:after="80"/>
             </w:pPr>
             <w:r>
               <w:rPr>
                 <w:rFonts w:ascii="HY중고딕" w:eastAsia="HY중고딕" w:hAnsi="HY중고딕" w:cs="HY중고딕"/>
                 <w:b/>
                 <w:sz w:val="20"/>
-                <w:szCs w:val="20"/>
-              </w:rPr>
-              <w:t xml:space="preserve">■ 현장 대응자 (문제를 이미 겪고 있는 전문가)</w:t>
-            </w:r>
-          </w:p>
-          <w:p>
-            <w:pPr>
-              <w:pStyle w:val="a3"/>
-              <w:ind w:left="200"/>
-              <w:spacing w:after="0" w:line="260" w:lineRule="auto"/>
-            </w:pPr>
-            <w:r>
-              <w:rPr>
-                <w:rFonts w:ascii="HY중고딕" w:eastAsia="HY중고딕" w:hAnsi="HY중고딕" w:cs="HY중고딕"/>
-                <w:sz w:val="20"/>
-                <w:szCs w:val="20"/>
-              </w:rPr>
-              <w:t xml:space="preserve">‣ 한국도박문제예방치유원 상담사 — 노출 경로를 파악해 개입 시점을 정해야 하는 위치</w:t>
-            </w:r>
-          </w:p>
-          <w:p>
-            <w:pPr>
-              <w:pStyle w:val="a3"/>
-              <w:spacing w:after="0" w:line="260" w:lineRule="auto"/>
-            </w:pPr>
-          </w:p>
-          <w:p>
-            <w:pPr>
-              <w:pStyle w:val="a3"/>
-              <w:spacing w:after="0" w:line="260" w:lineRule="auto"/>
+              </w:rPr>
+              <w:t xml:space="preserve">◦ 1차 사용자(기기 소유자): 만 14~16세(중2~고1) 청소년,</w:t>
+            </w:r>
+            <w:r>
+              <w:rPr>
+                <w:rFonts w:ascii="HY중고딕" w:eastAsia="HY중고딕" w:hAnsi="HY중고딕" w:cs="HY중고딕"/>
+                <w:sz w:val="20"/>
+              </w:rPr>
+              <w:t xml:space="preserve"> 특히 스마트폰으로 무료 스포츠 중계·불법 스트리밍을 보는 남학생(자진신고 청소년 평균 연령 15.5세, 카지노형 95.9%). 상황 단계로 세분하면 ㉠ 미노출 → ㉡ 노출(중계 배너·단톡방 링크를 봄) → ㉢ 첫 충전 시도 → ㉣ 반복 이용이며, 본 서비스의 개입 범위는 ㉡~㉢ 사이다. ㉣은 상담·치유 영역으로 넘긴다.</w:t>
+            </w:r>
+          </w:p>
+          <w:p>
+            <w:pPr>
+              <w:pStyle w:val="a3"/>
+              <w:spacing w:after="80"/>
             </w:pPr>
             <w:r>
               <w:rPr>
                 <w:rFonts w:ascii="HY중고딕" w:eastAsia="HY중고딕" w:hAnsi="HY중고딕" w:cs="HY중고딕"/>
                 <w:b/>
                 <w:sz w:val="20"/>
-                <w:szCs w:val="20"/>
-              </w:rPr>
-              <w:t xml:space="preserve">■ 확장 대상 (본 과제의 1차 범위에는 포함하지 않음)</w:t>
-            </w:r>
-          </w:p>
-          <w:p>
-            <w:pPr>
-              <w:pStyle w:val="a3"/>
-              <w:ind w:left="200"/>
-              <w:spacing w:after="0" w:line="260" w:lineRule="auto"/>
-            </w:pPr>
-            <w:r>
-              <w:rPr>
-                <w:rFonts w:ascii="HY중고딕" w:eastAsia="HY중고딕" w:hAnsi="HY중고딕" w:cs="HY중고딕"/>
-                <w:sz w:val="20"/>
-                <w:szCs w:val="20"/>
-              </w:rPr>
-              <w:t xml:space="preserve">‣ 병영 내에서 스마트폰을 사용하는 장병 — 문제 구조는 동일하나 생활 환경과 관리 주체가 달라 별도 검증이 필요하므로, 본 과제에서는 확장 시나리오로만 다룬다.</w:t>
+              </w:rPr>
+              <w:t xml:space="preserve">◦ 채널·관리자:</w:t>
+            </w:r>
+            <w:r>
+              <w:rPr>
+                <w:rFonts w:ascii="HY중고딕" w:eastAsia="HY중고딕" w:hAnsi="HY중고딕" w:cs="HY중고딕"/>
+                <w:sz w:val="20"/>
+              </w:rPr>
+              <w:t xml:space="preserve"> 이동통신사 자녀안심 서비스(개통 시 설치 경로), 학교(정보윤리 교육·Wee클래스 상담교사), 한국도박문제예방치유원 상담사(1336). 노출 경로·개입 시점 정보를 필요로 하며 도입 경로가 된다.</w:t>
+            </w:r>
+          </w:p>
+          <w:p>
+            <w:pPr>
+              <w:pStyle w:val="a3"/>
+            </w:pPr>
+            <w:r>
+              <w:rPr>
+                <w:rFonts w:ascii="HY중고딕" w:eastAsia="HY중고딕" w:hAnsi="HY중고딕" w:cs="HY중고딕"/>
+                <w:b/>
+                <w:sz w:val="20"/>
+              </w:rPr>
+              <w:t xml:space="preserve">◦ 범위 제외:</w:t>
+            </w:r>
+            <w:r>
+              <w:rPr>
+                <w:rFonts w:ascii="HY중고딕" w:eastAsia="HY중고딕" w:hAnsi="HY중고딕" w:cs="HY중고딕"/>
+                <w:sz w:val="20"/>
+              </w:rPr>
+              <w:t xml:space="preserve"> 성인 도박자, 병영 내 장병(배경 근거로만 사용), 이미 반복 이용 단계(㉣)의 청소년, 정상 게임·합법 사행산업(공식 스포츠토토·복권 앱) 이용자 — 이들의 화면은 판정 대상이 아니라 통과시켜야 할 대상이다.</w:t>
             </w:r>
           </w:p>
         </w:tc>
@@ -1202,168 +1182,152 @@
           <w:p>
             <w:pPr>
               <w:pStyle w:val="a3"/>
-              <w:spacing w:after="0" w:line="260" w:lineRule="auto"/>
             </w:pPr>
             <w:r>
               <w:rPr>
                 <w:rFonts w:ascii="HY중고딕" w:eastAsia="HY중고딕" w:hAnsi="HY중고딕" w:cs="HY중고딕"/>
                 <w:b/>
                 <w:sz w:val="20"/>
-                <w:szCs w:val="20"/>
-              </w:rPr>
-              <w:t xml:space="preserve">■ 중·고등학생</w:t>
-            </w:r>
-          </w:p>
-          <w:p>
-            <w:pPr>
-              <w:pStyle w:val="a3"/>
-              <w:ind w:left="200"/>
-              <w:spacing w:after="0" w:line="260" w:lineRule="auto"/>
-            </w:pPr>
-            <w:r>
-              <w:rPr>
-                <w:rFonts w:ascii="HY중고딕" w:eastAsia="HY중고딕" w:hAnsi="HY중고딕" w:cs="HY중고딕"/>
-                <w:sz w:val="20"/>
-                <w:szCs w:val="20"/>
-              </w:rPr>
-              <w:t xml:space="preserve">‣ 고충(pain point) : 무료 중계 사이트를 보는 도중 도박 배너가 반복적으로 노출되며, 그것이 광고인지 사이트의 기능인지 구분되지 않는다.</w:t>
-            </w:r>
-          </w:p>
-          <w:p>
-            <w:pPr>
-              <w:pStyle w:val="a3"/>
-              <w:ind w:left="200"/>
-              <w:spacing w:after="0" w:line="260" w:lineRule="auto"/>
-            </w:pPr>
-            <w:r>
-              <w:rPr>
-                <w:rFonts w:ascii="HY중고딕" w:eastAsia="HY중고딕" w:hAnsi="HY중고딕" w:cs="HY중고딕"/>
-                <w:sz w:val="20"/>
-                <w:szCs w:val="20"/>
-              </w:rPr>
-              <w:t xml:space="preserve">‣ 니즈(needs) : "지금 보고 있는 이 화면이 위험한 것인지" 스스로 판단할 수 있기를 원한다.</w:t>
-            </w:r>
-          </w:p>
-          <w:p>
-            <w:pPr>
-              <w:pStyle w:val="a3"/>
-              <w:spacing w:after="0" w:line="260" w:lineRule="auto"/>
-            </w:pPr>
-          </w:p>
-          <w:p>
-            <w:pPr>
-              <w:pStyle w:val="a3"/>
-              <w:spacing w:after="0" w:line="260" w:lineRule="auto"/>
+              </w:rPr>
+              <w:t xml:space="preserve">청소년 (1차 사용자)</w:t>
+            </w:r>
+          </w:p>
+          <w:p>
+            <w:pPr>
+              <w:pStyle w:val="a3"/>
+            </w:pPr>
+            <w:r>
+              <w:rPr>
+                <w:rFonts w:ascii="HY중고딕" w:eastAsia="HY중고딕" w:hAnsi="HY중고딕" w:cs="HY중고딕"/>
+                <w:sz w:val="20"/>
+              </w:rPr>
+              <w:t xml:space="preserve">‣ 고충: "공짜로 축구 보는 사이트인데 밑에 계속 뜨는 게 뭔지 모르겠어요."(예상 표현) 무료 중계 화면의 도박 배너를 광고인지 게임인지 도박인지 구분하지 못한다.</w:t>
+            </w:r>
+          </w:p>
+          <w:p>
+            <w:pPr>
+              <w:pStyle w:val="a3"/>
+            </w:pPr>
+            <w:r>
+              <w:rPr>
+                <w:rFonts w:ascii="HY중고딕" w:eastAsia="HY중고딕" w:hAnsi="HY중고딕" w:cs="HY중고딕"/>
+                <w:sz w:val="20"/>
+              </w:rPr>
+              <w:t xml:space="preserve">‣ 고충: "엄마가 깐 앱은 나를 감시하는 거라 바로 지웠어요."(예상 표현) 보호자가 깐 감시형 앱은 삭제·우회의 대상이 된다. 정상 게임까지 막히면 더 빨리 지운다.</w:t>
+            </w:r>
+          </w:p>
+          <w:p>
+            <w:pPr>
+              <w:pStyle w:val="a3"/>
+              <w:spacing w:after="80"/>
+            </w:pPr>
+            <w:r>
+              <w:rPr>
+                <w:rFonts w:ascii="HY중고딕" w:eastAsia="HY중고딕" w:hAnsi="HY중고딕" w:cs="HY중고딕"/>
+                <w:sz w:val="20"/>
+              </w:rPr>
+              <w:t xml:space="preserve">‣ 니즈: 지금 보는 화면이 위험한지 스스로 알고 싶다. 감시가 아니라 내 폰을 지켜 주는 기능(피싱·스미싱·사기 사이트 차단)이라면 스스로 켤 의향이 있다.</w:t>
+            </w:r>
+          </w:p>
+          <w:p>
+            <w:pPr>
+              <w:pStyle w:val="a3"/>
             </w:pPr>
             <w:r>
               <w:rPr>
                 <w:rFonts w:ascii="HY중고딕" w:eastAsia="HY중고딕" w:hAnsi="HY중고딕" w:cs="HY중고딕"/>
                 <w:b/>
                 <w:sz w:val="20"/>
-                <w:szCs w:val="20"/>
-              </w:rPr>
-              <w:t xml:space="preserve">■ 학부모</w:t>
-            </w:r>
-          </w:p>
-          <w:p>
-            <w:pPr>
-              <w:pStyle w:val="a3"/>
-              <w:ind w:left="200"/>
-              <w:spacing w:after="0" w:line="260" w:lineRule="auto"/>
-            </w:pPr>
-            <w:r>
-              <w:rPr>
-                <w:rFonts w:ascii="HY중고딕" w:eastAsia="HY중고딕" w:hAnsi="HY중고딕" w:cs="HY중고딕"/>
-                <w:sz w:val="20"/>
-                <w:szCs w:val="20"/>
-              </w:rPr>
-              <w:t xml:space="preserve">‣ 고충(pain point) : 유해사이트 차단 앱을 설치해도 새로운 도메인이 계속 생겨 뚫리고, 결국 아이와의 갈등만 남는다.</w:t>
-            </w:r>
-          </w:p>
-          <w:p>
-            <w:pPr>
-              <w:pStyle w:val="a3"/>
-              <w:ind w:left="200"/>
-              <w:spacing w:after="0" w:line="260" w:lineRule="auto"/>
-            </w:pPr>
-            <w:r>
-              <w:rPr>
-                <w:rFonts w:ascii="HY중고딕" w:eastAsia="HY중고딕" w:hAnsi="HY중고딕" w:cs="HY중고딕"/>
-                <w:sz w:val="20"/>
-                <w:szCs w:val="20"/>
-              </w:rPr>
-              <w:t xml:space="preserve">‣ 니즈(needs) : 감시하고 통제하는 방식이 아니라, 위험한 화면일 때 경고해 주는 수단을 원한다.</w:t>
-            </w:r>
-          </w:p>
-          <w:p>
-            <w:pPr>
-              <w:pStyle w:val="a3"/>
-              <w:spacing w:after="0" w:line="260" w:lineRule="auto"/>
-            </w:pPr>
-          </w:p>
-          <w:p>
-            <w:pPr>
-              <w:pStyle w:val="a3"/>
-              <w:spacing w:after="0" w:line="260" w:lineRule="auto"/>
+              </w:rPr>
+              <w:t xml:space="preserve">학부모 (보호자)</w:t>
+            </w:r>
+          </w:p>
+          <w:p>
+            <w:pPr>
+              <w:pStyle w:val="a3"/>
+            </w:pPr>
+            <w:r>
+              <w:rPr>
+                <w:rFonts w:ascii="HY중고딕" w:eastAsia="HY중고딕" w:hAnsi="HY중고딕" w:cs="HY중고딕"/>
+                <w:sz w:val="20"/>
+              </w:rPr>
+              <w:t xml:space="preserve">‣ 고충: "차단 앱을 깔아도 애가 다른 주소로 들어가요. 결국 매일 싸움만 나요."(예상 표현) 차단 앱이 새 도메인을 따라가지 못하고, 통제는 갈등으로 끝난다.</w:t>
+            </w:r>
+          </w:p>
+          <w:p>
+            <w:pPr>
+              <w:pStyle w:val="a3"/>
+            </w:pPr>
+            <w:r>
+              <w:rPr>
+                <w:rFonts w:ascii="HY중고딕" w:eastAsia="HY중고딕" w:hAnsi="HY중고딕" w:cs="HY중고딕"/>
+                <w:sz w:val="20"/>
+              </w:rPr>
+              <w:t xml:space="preserve">‣ 고충: "몰래 깔 수도 없고, 대놓고 깔면 애가 지워요. 돈이 나가는 것만이라도 알고 싶어요."(예상 표현) 감시와 방임 사이에서 쓸 수 있는 수단이 없다.</w:t>
+            </w:r>
+          </w:p>
+          <w:p>
+            <w:pPr>
+              <w:pStyle w:val="a3"/>
+              <w:spacing w:after="80"/>
+            </w:pPr>
+            <w:r>
+              <w:rPr>
+                <w:rFonts w:ascii="HY중고딕" w:eastAsia="HY중고딕" w:hAnsi="HY중고딕" w:cs="HY중고딕"/>
+                <w:sz w:val="20"/>
+              </w:rPr>
+              <w:t xml:space="preserve">‣ 니즈: 감시하지 않으면서 돈이 나가는 순간만 알 수 있는 수단. 자녀가 거부하지 않는 도입 방법. 정상 게임·유튜브·쇼핑은 건드리지 않을 것.</w:t>
+            </w:r>
+          </w:p>
+          <w:p>
+            <w:pPr>
+              <w:pStyle w:val="a3"/>
             </w:pPr>
             <w:r>
               <w:rPr>
                 <w:rFonts w:ascii="HY중고딕" w:eastAsia="HY중고딕" w:hAnsi="HY중고딕" w:cs="HY중고딕"/>
                 <w:b/>
                 <w:sz w:val="20"/>
-                <w:szCs w:val="20"/>
-              </w:rPr>
-              <w:t xml:space="preserve">■ 상담교사 · 상담사</w:t>
-            </w:r>
-          </w:p>
-          <w:p>
-            <w:pPr>
-              <w:pStyle w:val="a3"/>
-              <w:ind w:left="200"/>
-              <w:spacing w:after="0" w:line="260" w:lineRule="auto"/>
-            </w:pPr>
-            <w:r>
-              <w:rPr>
-                <w:rFonts w:ascii="HY중고딕" w:eastAsia="HY중고딕" w:hAnsi="HY중고딕" w:cs="HY중고딕"/>
-                <w:sz w:val="20"/>
-                <w:szCs w:val="20"/>
-              </w:rPr>
-              <w:t xml:space="preserve">‣ 고충(pain point) : 학생이 어디서 처음 도박을 접했는지 확인할 방법이 없어 개입 시점을 놓친다.</w:t>
-            </w:r>
-          </w:p>
-          <w:p>
-            <w:pPr>
-              <w:pStyle w:val="a3"/>
-              <w:ind w:left="200"/>
-              <w:spacing w:after="0" w:line="260" w:lineRule="auto"/>
-            </w:pPr>
-            <w:r>
-              <w:rPr>
-                <w:rFonts w:ascii="HY중고딕" w:eastAsia="HY중고딕" w:hAnsi="HY중고딕" w:cs="HY중고딕"/>
-                <w:sz w:val="20"/>
-                <w:szCs w:val="20"/>
-              </w:rPr>
-              <w:t xml:space="preserve">‣ 니즈(needs) : 최초 노출 경로를 확인할 수 있는 객관적 근거를 원한다.</w:t>
-            </w:r>
-          </w:p>
-          <w:p>
-            <w:pPr>
-              <w:pStyle w:val="a3"/>
-              <w:spacing w:after="0" w:line="260" w:lineRule="auto"/>
-            </w:pPr>
-          </w:p>
-          <w:p>
-            <w:pPr>
-              <w:pStyle w:val="a3"/>
-              <w:spacing w:after="0" w:line="260" w:lineRule="auto"/>
-            </w:pPr>
-            <w:r>
-              <w:rPr>
-                <w:rFonts w:ascii="HY중고딕" w:eastAsia="HY중고딕" w:hAnsi="HY중고딕" w:cs="HY중고딕"/>
-                <w:sz w:val="20"/>
-                <w:szCs w:val="20"/>
-              </w:rPr>
-              <w:t xml:space="preserve">※ 현 단계의 고충·니즈는 문헌 조사와 사전 조사에 기반한 가설이며, 8번 공감 계획의 인터뷰·관찰을 통해 검증하고 이해당사자의 표현으로 재기술한다.</w:t>
+              </w:rPr>
+              <w:t xml:space="preserve">상담교사·상담사 (현장 대응자)</w:t>
+            </w:r>
+          </w:p>
+          <w:p>
+            <w:pPr>
+              <w:pStyle w:val="a3"/>
+            </w:pPr>
+            <w:r>
+              <w:rPr>
+                <w:rFonts w:ascii="HY중고딕" w:eastAsia="HY중고딕" w:hAnsi="HY중고딕" w:cs="HY중고딕"/>
+                <w:sz w:val="20"/>
+              </w:rPr>
+              <w:t xml:space="preserve">‣ 고충: "상담실에 올 때는 이미 열 달이 지나 있어요. 어디서 처음 봤는지도 아이가 기억을 못 해요."(예상 표현) 최초 노출 경로를 확인할 수 없어 개입 시점을 놓친다.</w:t>
+            </w:r>
+          </w:p>
+          <w:p>
+            <w:pPr>
+              <w:pStyle w:val="a3"/>
+              <w:spacing w:after="80"/>
+            </w:pPr>
+            <w:r>
+              <w:rPr>
+                <w:rFonts w:ascii="HY중고딕" w:eastAsia="HY중고딕" w:hAnsi="HY중고딕" w:cs="HY중고딕"/>
+                <w:sz w:val="20"/>
+              </w:rPr>
+              <w:t xml:space="preserve">‣ 니즈: 노출 경로·시점을 확인할 근거, 그리고 상담 이전 단계에서 조기 발견할 수 있는 신호.</w:t>
+            </w:r>
+          </w:p>
+          <w:p>
+            <w:pPr>
+              <w:pStyle w:val="a3"/>
+            </w:pPr>
+            <w:r>
+              <w:rPr>
+                <w:rFonts w:ascii="HY중고딕" w:eastAsia="HY중고딕" w:hAnsi="HY중고딕" w:cs="HY중고딕"/>
+                <w:color w:val="595959"/>
+                <w:sz w:val="18"/>
+              </w:rPr>
+              <w:t xml:space="preserve">※ 위 고충·니즈는 문헌·통계 기반 가설이며, 8번 공감 계획(보호자 3인·청소년 3인·상담사 1~2인 인터뷰, 노출 상황 관찰)으로 검증·수정한다.</w:t>
             </w:r>
           </w:p>
         </w:tc>
@@ -1416,103 +1380,97 @@
           <w:p>
             <w:pPr>
               <w:pStyle w:val="a3"/>
-              <w:spacing w:after="0" w:line="260" w:lineRule="auto"/>
-            </w:pPr>
+              <w:ind w:left="240" w:hanging="240"/>
+            </w:pPr>
+            <w:r>
+              <w:rPr>
+                <w:rFonts w:ascii="HY중고딕" w:eastAsia="HY중고딕" w:hAnsi="HY중고딕" w:cs="HY중고딕"/>
+                <w:sz w:val="20"/>
+              </w:rPr>
+              <w:t xml:space="preserve">‣ </w:t>
+            </w:r>
             <w:r>
               <w:rPr>
                 <w:rFonts w:ascii="HY중고딕" w:eastAsia="HY중고딕" w:hAnsi="HY중고딕" w:cs="HY중고딕"/>
                 <w:b/>
                 <w:sz w:val="20"/>
-                <w:szCs w:val="20"/>
-              </w:rPr>
-              <w:t xml:space="preserve">■ 중·고등학생 — 피해가 짧은 기간에 커지기 때문</w:t>
-            </w:r>
-          </w:p>
-          <w:p>
-            <w:pPr>
-              <w:pStyle w:val="a3"/>
-              <w:ind w:left="200"/>
-              <w:spacing w:after="0" w:line="260" w:lineRule="auto"/>
-            </w:pPr>
-            <w:r>
-              <w:rPr>
-                <w:rFonts w:ascii="HY중고딕" w:eastAsia="HY중고딕" w:hAnsi="HY중고딕" w:cs="HY중고딕"/>
-                <w:sz w:val="20"/>
-                <w:szCs w:val="20"/>
-              </w:rPr>
-              <w:t xml:space="preserve">‣ 청소년이 가장 많이 접하는 온라인 카지노 도박은 스포츠토토나 실시간 게임보다 결과 확인이 빠른 즉시성을 지녀 도박 규모를 키우기 쉽고 중독성이 높다. 최초 노출 단계에서 끊는 것이 사실상 유일한 저비용 개입 지점이다.</w:t>
-            </w:r>
-          </w:p>
-          <w:p>
-            <w:pPr>
-              <w:pStyle w:val="a3"/>
-              <w:spacing w:after="0" w:line="260" w:lineRule="auto"/>
-            </w:pPr>
-          </w:p>
-          <w:p>
-            <w:pPr>
-              <w:pStyle w:val="a3"/>
-              <w:spacing w:after="0" w:line="260" w:lineRule="auto"/>
-            </w:pPr>
+              </w:rPr>
+              <w:t xml:space="preserve">청소년 — </w:t>
+            </w:r>
+            <w:r>
+              <w:rPr>
+                <w:rFonts w:ascii="HY중고딕" w:eastAsia="HY중고딕" w:hAnsi="HY중고딕" w:cs="HY중고딕"/>
+                <w:sz w:val="20"/>
+              </w:rPr>
+              <w:t xml:space="preserve">노출에서 시도까지 이어지는 시간이 짧고, 시작 연령이 평균 15.5세다. 자진신고 시점까지 평균 10개월 동안 평균 300만 원을 잃는다. 노출 순간에 "이건 도박이다"라고 알 수 있으면 첫 클릭 전에 멈출 수 있다. 본인에게는 용돈·아르바이트비, 나아가 친구 간 금전 거래와 학교생활이 걸린 문제다.</w:t>
+            </w:r>
+          </w:p>
+          <w:p>
+            <w:pPr>
+              <w:pStyle w:val="a3"/>
+              <w:ind w:left="240" w:hanging="240"/>
+            </w:pPr>
+            <w:r>
+              <w:rPr>
+                <w:rFonts w:ascii="HY중고딕" w:eastAsia="HY중고딕" w:hAnsi="HY중고딕" w:cs="HY중고딕"/>
+                <w:sz w:val="20"/>
+              </w:rPr>
+              <w:t xml:space="preserve">‣ </w:t>
+            </w:r>
             <w:r>
               <w:rPr>
                 <w:rFonts w:ascii="HY중고딕" w:eastAsia="HY중고딕" w:hAnsi="HY중고딕" w:cs="HY중고딕"/>
                 <w:b/>
                 <w:sz w:val="20"/>
-                <w:szCs w:val="20"/>
-              </w:rPr>
-              <w:t xml:space="preserve">■ 학부모 — 회복 비용이 예방 비용보다 압도적으로 크기 때문</w:t>
-            </w:r>
-          </w:p>
-          <w:p>
-            <w:pPr>
-              <w:pStyle w:val="a3"/>
-              <w:ind w:left="200"/>
-              <w:spacing w:after="0" w:line="260" w:lineRule="auto"/>
-            </w:pPr>
-            <w:r>
-              <w:rPr>
-                <w:rFonts w:ascii="HY중고딕" w:eastAsia="HY중고딕" w:hAnsi="HY중고딕" w:cs="HY중고딕"/>
-                <w:sz w:val="20"/>
-                <w:szCs w:val="20"/>
-              </w:rPr>
-              <w:t xml:space="preserve">‣ 도박 빚은 사채로 이어진다. 군에서는 장병내일준비적금으로 모은 목돈과 매칭지원금까지 담보로 잡아 사채를 얻는 사례가 보고되었다. 금전적 피해가 확정된 뒤의 회복은 개인회생·채무조정 단계로 넘어가며, 가정 단위의 손실로 확대된다.</w:t>
-            </w:r>
-          </w:p>
-          <w:p>
-            <w:pPr>
-              <w:pStyle w:val="a3"/>
-              <w:spacing w:after="0" w:line="260" w:lineRule="auto"/>
-            </w:pPr>
-          </w:p>
-          <w:p>
-            <w:pPr>
-              <w:pStyle w:val="a3"/>
-              <w:spacing w:after="0" w:line="260" w:lineRule="auto"/>
-            </w:pPr>
+              </w:rPr>
+              <w:t xml:space="preserve">학부모 — </w:t>
+            </w:r>
+            <w:r>
+              <w:rPr>
+                <w:rFonts w:ascii="HY중고딕" w:eastAsia="HY중고딕" w:hAnsi="HY중고딕" w:cs="HY중고딕"/>
+                <w:sz w:val="20"/>
+              </w:rPr>
+              <w:t xml:space="preserve">도박 빚은 사채·대리입금으로 이어지고, 장병 사례에서는 장병내일준비적금 같은 목돈까지 담보로 잡힌다. 초기 노출을 차단하는 비용이 사후 치유·채무 정리 비용보다 훨씬 낮다. 또한 감시형 통제는 자녀와의 관계를 해치므로, 관계를 지키면서 보호하는 방법이 필요하다.</w:t>
+            </w:r>
+          </w:p>
+          <w:p>
+            <w:pPr>
+              <w:pStyle w:val="a3"/>
+              <w:ind w:left="240" w:hanging="240"/>
+            </w:pPr>
+            <w:r>
+              <w:rPr>
+                <w:rFonts w:ascii="HY중고딕" w:eastAsia="HY중고딕" w:hAnsi="HY중고딕" w:cs="HY중고딕"/>
+                <w:sz w:val="20"/>
+              </w:rPr>
+              <w:t xml:space="preserve">‣ </w:t>
+            </w:r>
             <w:r>
               <w:rPr>
                 <w:rFonts w:ascii="HY중고딕" w:eastAsia="HY중고딕" w:hAnsi="HY중고딕" w:cs="HY중고딕"/>
                 <w:b/>
                 <w:sz w:val="20"/>
-                <w:szCs w:val="20"/>
-              </w:rPr>
-              <w:t xml:space="preserve">■ 상담교사 · 상담사 — 현행 지표가 실태를 반영하지 못하기 때문</w:t>
-            </w:r>
-          </w:p>
-          <w:p>
-            <w:pPr>
-              <w:pStyle w:val="a3"/>
-              <w:ind w:left="200"/>
-              <w:spacing w:after="0" w:line="260" w:lineRule="auto"/>
-            </w:pPr>
-            <w:r>
-              <w:rPr>
-                <w:rFonts w:ascii="HY중고딕" w:eastAsia="HY중고딕" w:hAnsi="HY중고딕" w:cs="HY중고딕"/>
-                <w:sz w:val="20"/>
-                <w:szCs w:val="20"/>
-              </w:rPr>
-              <w:t xml:space="preserve">‣ 육군의 사이버도박 입건자는 313명으로 병력 32만 4천 명의 약 0.1%에 불과하지만, 최근 전역자 30명 대상 설문에서는 56%가 부대 내 불법도박을 목격했다고 답했다. 적발·신고에 의존하는 방식이 실태를 포착하지 못한다는 뜻이며, 자동 탐지 수단이 필요한 직접적 근거가 된다.</w:t>
+              </w:rPr>
+              <w:t xml:space="preserve">상담교사·상담사 — </w:t>
+            </w:r>
+            <w:r>
+              <w:rPr>
+                <w:rFonts w:ascii="HY중고딕" w:eastAsia="HY중고딕" w:hAnsi="HY중고딕" w:cs="HY중고딕"/>
+                <w:sz w:val="20"/>
+              </w:rPr>
+              <w:t xml:space="preserve">자진신고제 시범사업의 3개월 내 재도박률은 0.8%로 치유 효과는 높지만, 개입까지 평균 10개월이 걸린다. 발견이 빨라질수록 같은 치유 자원으로 더 많은 청소년을 더 적은 피해 상태에서 회복시킬 수 있다. 공식 적발 통계(육군 입건자 0.1%)와 실제 목격률(전역자 설문 56%)의 격차는 신고·적발 의존 체계의 한계를 보여주며, 노출 단계의 자동 감지가 있어야 개입 시점을 앞당길 수 있다.</w:t>
+            </w:r>
+          </w:p>
+          <w:p>
+            <w:pPr>
+              <w:pStyle w:val="a3"/>
+            </w:pPr>
+            <w:r>
+              <w:rPr>
+                <w:rFonts w:ascii="HY중고딕" w:eastAsia="HY중고딕" w:hAnsi="HY중고딕" w:cs="HY중고딕"/>
+                <w:sz w:val="20"/>
+              </w:rPr>
+              <w:t xml:space="preserve">‣ 공통 — 정상 게임·합법 앱(모바일 게임 인앱결제, 공식 스포츠토토·복권 앱, 쇼핑·앱마켓 결제)까지 막히면 청소년은 보호 기능을 끄고 보호자는 신뢰를 잃는다. 도박 콘텐츠만 정확히 짚어 나머지는 통과시키는 것이 해결의 전제이며, 그래서 데이터셋에 정상 게임·정상 결제 화면(하드 네거티브)을 별도 클래스로 둔다.</w:t>
             </w:r>
           </w:p>
         </w:tc>
@@ -1589,76 +1547,93 @@
           <w:p>
             <w:pPr>
               <w:pStyle w:val="a3"/>
-              <w:ind w:left="200"/>
-              <w:spacing w:after="0" w:line="260" w:lineRule="auto"/>
-            </w:pPr>
-            <w:r>
-              <w:rPr>
-                <w:rFonts w:ascii="HY중고딕" w:eastAsia="HY중고딕" w:hAnsi="HY중고딕" w:cs="HY중고딕"/>
-                <w:sz w:val="20"/>
-                <w:szCs w:val="20"/>
-              </w:rPr>
-              <w:t xml:space="preserve">‣ 보안 애플리케이션을 개발·운영하며 악성 URL 및 QR 탐지 기능을 다루는 과정에서, 도메인 기반 차단이 신규 도메인 생성 속도를 따라가지 못하는 한계를 현장에서 직접 확인했다.</w:t>
-            </w:r>
-          </w:p>
-          <w:p>
-            <w:pPr>
-              <w:pStyle w:val="a3"/>
-              <w:ind w:left="200"/>
-              <w:spacing w:after="0" w:line="260" w:lineRule="auto"/>
-            </w:pPr>
-            <w:r>
-              <w:rPr>
-                <w:rFonts w:ascii="HY중고딕" w:eastAsia="HY중고딕" w:hAnsi="HY중고딕" w:cs="HY중고딕"/>
-                <w:sz w:val="20"/>
-                <w:szCs w:val="20"/>
-              </w:rPr>
-              <w:t xml:space="preserve">‣ 주소가 아니라 화면을 판정하는 방식으로 접근하면 도메인 교체·우회에 영향을 받지 않는 탐지가 가능하다고 판단했고, 이 가설을 실제 데이터로 검증해보고자 한다.</w:t>
-            </w:r>
-          </w:p>
-          <w:p>
-            <w:pPr>
-              <w:pStyle w:val="a3"/>
-              <w:ind w:left="200"/>
-              <w:spacing w:after="0" w:line="260" w:lineRule="auto"/>
-            </w:pPr>
-            <w:r>
-              <w:rPr>
-                <w:rFonts w:ascii="HY중고딕" w:eastAsia="HY중고딕" w:hAnsi="HY중고딕" w:cs="HY중고딕"/>
-                <w:sz w:val="20"/>
-                <w:szCs w:val="20"/>
-              </w:rPr>
-              <w:t xml:space="preserve">‣ OCR로 추출한 텍스트와 이미지 정보를 함께 사용하는 멀티모달 구조를 직접 설계·구현하고, 단일 모달 대비 성능 차이를 정량적으로 확인하는 경험을 쌓고자 한다.</w:t>
-            </w:r>
-          </w:p>
-          <w:p>
-            <w:pPr>
-              <w:pStyle w:val="a3"/>
-              <w:ind w:left="200"/>
-              <w:spacing w:after="0" w:line="260" w:lineRule="auto"/>
-            </w:pPr>
-            <w:r>
-              <w:rPr>
-                <w:rFonts w:ascii="HY중고딕" w:eastAsia="HY중고딕" w:hAnsi="HY중고딕" w:cs="HY중고딕"/>
-                <w:sz w:val="20"/>
-                <w:szCs w:val="20"/>
-              </w:rPr>
-              <w:t xml:space="preserve">‣ 사회적 피해 규모가 크면서도 기술적으로 해결 여지가 남아 있는 문제이며, 결과물이 실제 서비스와 후속 연구로 이어질 수 있다고 판단해 본 주제를 선정했다.</w:t>
-            </w:r>
-          </w:p>
-          <w:p>
-            <w:pPr>
-              <w:pStyle w:val="a3"/>
-              <w:ind w:left="200"/>
-              <w:spacing w:after="0" w:line="260" w:lineRule="auto"/>
-            </w:pPr>
-            <w:r>
-              <w:rPr>
-                <w:rFonts w:ascii="HY중고딕" w:eastAsia="HY중고딕" w:hAnsi="HY중고딕" w:cs="HY중고딕"/>
-                <w:sz w:val="20"/>
-                <w:szCs w:val="20"/>
-              </w:rPr>
-              <w:t xml:space="preserve">‣ 1인 프로젝트인 만큼 범위를 화면 단위 탐지 모델의 설계·비교·검증으로 한정하고, 데이터 수집과 실험 일정을 단계적으로 나누어 수행한다.</w:t>
+              <w:ind w:left="240" w:hanging="240"/>
+            </w:pPr>
+            <w:r>
+              <w:rPr>
+                <w:rFonts w:ascii="HY중고딕" w:eastAsia="HY중고딕" w:hAnsi="HY중고딕" w:cs="HY중고딕"/>
+                <w:sz w:val="20"/>
+              </w:rPr>
+              <w:t xml:space="preserve">‣ </w:t>
+            </w:r>
+            <w:r>
+              <w:rPr>
+                <w:rFonts w:ascii="HY중고딕" w:eastAsia="HY중고딕" w:hAnsi="HY중고딕" w:cs="HY중고딕"/>
+                <w:sz w:val="20"/>
+              </w:rPr>
+              <w:t xml:space="preserve">수행자는 악성 URL·QR 탐지 기능을 갖춘 보안 앱을 실제로 운영하면서, 도메인·URL 기반 차단이 갖는 한계를 현장에서 반복 확인했다. 차단 목록은 항상 한 박자 늦고, 정상 서비스 안에 삽입된 위험 콘텐츠는 주소만으로는 판단할 수 없다.</w:t>
+            </w:r>
+          </w:p>
+          <w:p>
+            <w:pPr>
+              <w:pStyle w:val="a3"/>
+              <w:ind w:left="240" w:hanging="240"/>
+            </w:pPr>
+            <w:r>
+              <w:rPr>
+                <w:rFonts w:ascii="HY중고딕" w:eastAsia="HY중고딕" w:hAnsi="HY중고딕" w:cs="HY중고딕"/>
+                <w:sz w:val="20"/>
+              </w:rPr>
+              <w:t xml:space="preserve">‣ </w:t>
+            </w:r>
+            <w:r>
+              <w:rPr>
+                <w:rFonts w:ascii="HY중고딕" w:eastAsia="HY중고딕" w:hAnsi="HY중고딕" w:cs="HY중고딕"/>
+                <w:sz w:val="20"/>
+              </w:rPr>
+              <w:t xml:space="preserve">그래서 "어디에 접속했는가"가 아니라 "지금 화면에 무엇이 보이는가"를 판단하는 접근으로 넘어가려 한다. 화면 속 텍스트(OCR)와 시각 요소를 함께 읽는 방식은 URL 교체에 영향을 받지 않고, 배너처럼 정상 콘텐츠에 섞여 있는 도박 콘텐츠도 잡을 수 있다.</w:t>
+            </w:r>
+          </w:p>
+          <w:p>
+            <w:pPr>
+              <w:pStyle w:val="a3"/>
+              <w:ind w:left="240" w:hanging="240"/>
+            </w:pPr>
+            <w:r>
+              <w:rPr>
+                <w:rFonts w:ascii="HY중고딕" w:eastAsia="HY중고딕" w:hAnsi="HY중고딕" w:cs="HY중고딕"/>
+                <w:sz w:val="20"/>
+              </w:rPr>
+              <w:t xml:space="preserve">‣ </w:t>
+            </w:r>
+            <w:r>
+              <w:rPr>
+                <w:rFonts w:ascii="HY중고딕" w:eastAsia="HY중고딕" w:hAnsi="HY중고딕" w:cs="HY중고딕"/>
+                <w:sz w:val="20"/>
+              </w:rPr>
+              <w:t xml:space="preserve">불법도박 피해가 청소년기에 시작되어 군 복무 이후까지 이어진다는 통계를 보면서, 가장 먼저 노출되는 집단인 청소년을 보호하는 도구를 직접 만들어 보고 싶었다. 운영 중인 앱에 실제로 탑재할 수 있는 결과물을 목표로 한다.</w:t>
+            </w:r>
+          </w:p>
+          <w:p>
+            <w:pPr>
+              <w:pStyle w:val="a3"/>
+              <w:ind w:left="240" w:hanging="240"/>
+            </w:pPr>
+            <w:r>
+              <w:rPr>
+                <w:rFonts w:ascii="HY중고딕" w:eastAsia="HY중고딕" w:hAnsi="HY중고딕" w:cs="HY중고딕"/>
+                <w:sz w:val="20"/>
+              </w:rPr>
+              <w:t xml:space="preserve">‣ </w:t>
+            </w:r>
+            <w:r>
+              <w:rPr>
+                <w:rFonts w:ascii="HY중고딕" w:eastAsia="HY중고딕" w:hAnsi="HY중고딕" w:cs="HY중고딕"/>
+                <w:sz w:val="20"/>
+              </w:rPr>
+              <w:t xml:space="preserve">1인 프로젝트이므로 범위는 화면 단위 도박 콘텐츠 탐지 모델의 설계·비교·검증과 데모 앱으로 한정하고, 상담 연계·보호자 대시보드 등은 후속 과제로 남긴다.</w:t>
+            </w:r>
+          </w:p>
+          <w:p>
+            <w:pPr>
+              <w:pStyle w:val="a3"/>
+            </w:pPr>
+            <w:r>
+              <w:rPr>
+                <w:rFonts w:ascii="HY중고딕" w:eastAsia="HY중고딕" w:hAnsi="HY중고딕" w:cs="HY중고딕"/>
+                <w:sz w:val="20"/>
+              </w:rPr>
+              <w:t xml:space="preserve">‣ 도입 방식도 의도의 일부다. 별도의 "감시 앱"이 아니라 수행자가 운영 중인 보안 앱(피싱·스미싱·악성 URL 차단)의 한 기능으로 넣어, 청소년이 자기 폰을 지키려고 스스로 설치하는 앱 안에서 도박 화면 보호가 함께 켜지도록 설계한다. 보호자에게 무엇을 알릴지는 자녀가 정하고, 화면 원본·위치는 어떤 경우에도 기기 밖으로 내보내지 않는다.</w:t>
             </w:r>
           </w:p>
         </w:tc>
@@ -1725,6 +1700,174 @@
             <w:pPr>
               <w:pStyle w:val="a3"/>
             </w:pPr>
+            <w:r>
+              <w:rPr>
+                <w:rFonts w:ascii="HY중고딕" w:eastAsia="HY중고딕" w:hAnsi="HY중고딕" w:cs="HY중고딕"/>
+                <w:b/>
+                <w:sz w:val="20"/>
+              </w:rPr>
+              <w:t xml:space="preserve">탐구 내용</w:t>
+            </w:r>
+          </w:p>
+          <w:p>
+            <w:pPr>
+              <w:pStyle w:val="a3"/>
+            </w:pPr>
+            <w:r>
+              <w:rPr>
+                <w:rFonts w:ascii="HY중고딕" w:eastAsia="HY중고딕" w:hAnsi="HY중고딕" w:cs="HY중고딕"/>
+                <w:sz w:val="20"/>
+              </w:rPr>
+              <w:t xml:space="preserve">‣ 한국어 도박 화면 데이터셋 구축: 도박 사이트 메인·베팅·충전 화면, 정상 서비스에 삽입된 도박 배너, 하드 네거티브(합법 스포츠토토·경기정보, 카지노풍 캐주얼 게임과 그 인앱결제 화면, 주식·코인 앱, 쇼핑·앱마켓·은행 결제 화면, 이벤트 룰렛 UI), 일반 화면을 포함해 2,000~3,000장. 도메인당 3~5장, 200개 이상 도메인, 도메인 단위 train/test 분리. 수집기는 구현·1차 수집 완료(GitHub src/crawler).</w:t>
+            </w:r>
+          </w:p>
+          <w:p>
+            <w:pPr>
+              <w:pStyle w:val="a3"/>
+            </w:pPr>
+            <w:r>
+              <w:rPr>
+                <w:rFonts w:ascii="HY중고딕" w:eastAsia="HY중고딕" w:hAnsi="HY중고딕" w:cs="HY중고딕"/>
+                <w:sz w:val="20"/>
+              </w:rPr>
+              <w:t xml:space="preserve">‣ 한국어 화면 OCR(EasyOCR·PaddleOCR) 성능 비교, 텍스트 분류(KoBERT·KLUE-RoBERTa), 이미지 분류(CNN·ViT), 두 모달을 결합한 융합 모델(early/late/cross-attention)의 비교 실험.</w:t>
+            </w:r>
+          </w:p>
+          <w:p>
+            <w:pPr>
+              <w:pStyle w:val="a3"/>
+            </w:pPr>
+            <w:r>
+              <w:rPr>
+                <w:rFonts w:ascii="HY중고딕" w:eastAsia="HY중고딕" w:hAnsi="HY중고딕" w:cs="HY중고딕"/>
+                <w:sz w:val="20"/>
+              </w:rPr>
+              <w:t xml:space="preserve">‣ "정상 게임은 통과" 검증: 하드 네거티브 셋으로 사이트 단위 분류는 틀리고 화면 콘텐츠 단위 분류는 맞추는 사례, 그리고 정상 게임·정상 결제 화면을 도박으로 잘못 잡는 비율(오탐률)을 수치로 검증.</w:t>
+            </w:r>
+          </w:p>
+          <w:p>
+            <w:pPr>
+              <w:pStyle w:val="a3"/>
+            </w:pPr>
+            <w:r>
+              <w:rPr>
+                <w:rFonts w:ascii="HY중고딕" w:eastAsia="HY중고딕" w:hAnsi="HY중고딕" w:cs="HY중고딕"/>
+                <w:sz w:val="20"/>
+              </w:rPr>
+              <w:t xml:space="preserve">‣ 2단계 개입 설계: 1단계 입장 경고(불법 도박 사이트 첫 진입 화면 판정 → 청소년 본인에게만 경고, 나가기 기본, 보호자 알림 없음) · 2단계 결제 직전 개입(충전·입금·상품권 핀·테더 화면 판정 → 30초 쿨다운 + 보호자 즉시 알림, 금액·사이트 유형만). 결제 직전 화면을 별도 클래스로 두고 재현율을 측정.</w:t>
+            </w:r>
+          </w:p>
+          <w:p>
+            <w:pPr>
+              <w:pStyle w:val="a3"/>
+            </w:pPr>
+            <w:r>
+              <w:rPr>
+                <w:rFonts w:ascii="HY중고딕" w:eastAsia="HY중고딕" w:hAnsi="HY중고딕" w:cs="HY중고딕"/>
+                <w:sz w:val="20"/>
+              </w:rPr>
+              <w:t xml:space="preserve">‣ 도입·수용성 검증: 자녀가 직접 켜는 온보딩과 알림 범위 동의 설정을 페이퍼 프로토타입으로 만들어 청소년·보호자 인터뷰에서 설치·유지 의향을 확인. 안드로이드 화면 캡처(MediaProjection)·접근성 권한과 iOS 스크린타임 API 제약을 정리해 설치 가능 범위(1차: 안드로이드)를 명시.</w:t>
+            </w:r>
+          </w:p>
+          <w:p>
+            <w:pPr>
+              <w:pStyle w:val="a3"/>
+              <w:spacing w:after="80"/>
+            </w:pPr>
+            <w:r>
+              <w:rPr>
+                <w:rFonts w:ascii="HY중고딕" w:eastAsia="HY중고딕" w:hAnsi="HY중고딕" w:cs="HY중고딕"/>
+                <w:sz w:val="20"/>
+              </w:rPr>
+              <w:t xml:space="preserve">‣ 모델 경량화(양자화·TFLite 변환)로 스마트폰 온디바이스 추론 가능성 검증.</w:t>
+            </w:r>
+          </w:p>
+          <w:p>
+            <w:pPr>
+              <w:pStyle w:val="a3"/>
+            </w:pPr>
+            <w:r>
+              <w:rPr>
+                <w:rFonts w:ascii="HY중고딕" w:eastAsia="HY중고딕" w:hAnsi="HY중고딕" w:cs="HY중고딕"/>
+                <w:b/>
+                <w:sz w:val="20"/>
+              </w:rPr>
+              <w:t xml:space="preserve">기대 결과물</w:t>
+            </w:r>
+          </w:p>
+          <w:p>
+            <w:pPr>
+              <w:pStyle w:val="a3"/>
+              <w:spacing w:after="80"/>
+            </w:pPr>
+            <w:r>
+              <w:rPr>
+                <w:rFonts w:ascii="HY중고딕" w:eastAsia="HY중고딕" w:hAnsi="HY중고딕" w:cs="HY중고딕"/>
+                <w:sz w:val="20"/>
+              </w:rPr>
+              <w:t xml:space="preserve">‣ 안드로이드 데모 앱(화면 캡처 → 판정 → 입장 경고 / 쿨다운 → 보호자 알림), 비교 실험 보고서, 라벨링 기준서와 데이터셋 메타데이터(공개 가능한 OCR 텍스트·라벨·특징 벡터), 보호자·청소년 인터뷰 결과 요약.</w:t>
+            </w:r>
+          </w:p>
+          <w:p>
+            <w:pPr>
+              <w:pStyle w:val="a3"/>
+            </w:pPr>
+            <w:r>
+              <w:rPr>
+                <w:rFonts w:ascii="HY중고딕" w:eastAsia="HY중고딕" w:hAnsi="HY중고딕" w:cs="HY중고딕"/>
+                <w:b/>
+                <w:sz w:val="20"/>
+              </w:rPr>
+              <w:t xml:space="preserve">잠정 달성 지표 (4주차 문제정의서에서 확정)</w:t>
+            </w:r>
+          </w:p>
+          <w:p>
+            <w:pPr>
+              <w:pStyle w:val="a3"/>
+            </w:pPr>
+            <w:r>
+              <w:rPr>
+                <w:rFonts w:ascii="HY중고딕" w:eastAsia="HY중고딕" w:hAnsi="HY중고딕" w:cs="HY중고딕"/>
+                <w:sz w:val="20"/>
+              </w:rPr>
+              <w:t xml:space="preserve">‣ 정량: 융합 모델 F1 0.90 이상 / 정상 게임·정상 결제 화면(하드 네거티브 500장) 오탐률 2% 이하 / 결제 직전 화면 재현율 0.90 이상 / OCR 단독·이미지 단독 대비 융합 모델 F1 우위 / 온디바이스 추론 1장당 1초 이내, 모델 크기 50MB 이하 / 라벨링 일치도 Cohen's kappa 0.8 이상(300장 이중 라벨링)</w:t>
+            </w:r>
+          </w:p>
+          <w:p>
+            <w:pPr>
+              <w:pStyle w:val="a3"/>
+            </w:pPr>
+            <w:r>
+              <w:rPr>
+                <w:rFonts w:ascii="HY중고딕" w:eastAsia="HY중고딕" w:hAnsi="HY중고딕" w:cs="HY중고딕"/>
+                <w:sz w:val="20"/>
+              </w:rPr>
+              <w:t xml:space="preserve">‣ 수용성: 청소년 인터뷰 대상의 70% 이상이 "내 폰 보호" 묶음이면 설치·유지 의향을 밝히고, 보호자의 80% 이상이 "충전 시도 즉시 + 일반 노출 주간 요약" 알림 범위를 감시가 아닌 것으로 받아들임.</w:t>
+            </w:r>
+          </w:p>
+          <w:p>
+            <w:pPr>
+              <w:pStyle w:val="a3"/>
+            </w:pPr>
+            <w:r>
+              <w:rPr>
+                <w:rFonts w:ascii="HY중고딕" w:eastAsia="HY중고딕" w:hAnsi="HY중고딕" w:cs="HY중고딕"/>
+                <w:sz w:val="20"/>
+              </w:rPr>
+              <w:t xml:space="preserve">‣ 정성: 학부모·상담교사 대상 데모 시연 후 "감시가 아닌 보호"로 받아들여지는지, 정상 게임이 막히지 않는지 피드백 확보.</w:t>
+            </w:r>
+          </w:p>
+          <w:p>
+            <w:pPr>
+              <w:pStyle w:val="a3"/>
+            </w:pPr>
+            <w:r>
+              <w:rPr>
+                <w:rFonts w:ascii="HY중고딕" w:eastAsia="HY중고딕" w:hAnsi="HY중고딕" w:cs="HY중고딕"/>
+                <w:sz w:val="20"/>
+              </w:rPr>
+              <w:t xml:space="preserve">‣ 확장: 화면 콘텐츠 단위로 동작하므로 병영 내 장병 등 다른 집단으로 재학습 없이 확장 가능함을 시사점으로 제시.</w:t>
+            </w:r>
           </w:p>
         </w:tc>
       </w:tr>
@@ -1892,6 +2035,13 @@
             <w:pPr>
               <w:pStyle w:val="a3"/>
             </w:pPr>
+            <w:r>
+              <w:rPr>
+                <w:rFonts w:ascii="HY중고딕" w:eastAsia="HY중고딕" w:hAnsi="HY중고딕" w:cs="HY중고딕"/>
+                <w:sz w:val="20"/>
+              </w:rPr>
+              <w:t xml:space="preserve">도메인 지식·선행연구: 불법도박 대응 체계(사감위·방심위·자진신고제), 청소년 보호 정책, 국내외 도박 사이트 탐지 연구 정리</w:t>
+            </w:r>
           </w:p>
         </w:tc>
         <w:tc>
@@ -1902,7 +2052,15 @@
           <w:p>
             <w:pPr>
               <w:pStyle w:val="a3"/>
-            </w:pPr>
+              <w:jc w:val="center"/>
+            </w:pPr>
+            <w:r>
+              <w:rPr>
+                <w:rFonts w:ascii="HY중고딕" w:eastAsia="HY중고딕" w:hAnsi="HY중고딕" w:cs="HY중고딕"/>
+                <w:sz w:val="20"/>
+              </w:rPr>
+              <w:t xml:space="preserve">9월 4주 ~ 10월 1주</w:t>
+            </w:r>
           </w:p>
         </w:tc>
         <w:tc>
@@ -1913,7 +2071,15 @@
           <w:p>
             <w:pPr>
               <w:pStyle w:val="a3"/>
-            </w:pPr>
+              <w:jc w:val="center"/>
+            </w:pPr>
+            <w:r>
+              <w:rPr>
+                <w:rFonts w:ascii="HY중고딕" w:eastAsia="HY중고딕" w:hAnsi="HY중고딕" w:cs="HY중고딕"/>
+                <w:sz w:val="20"/>
+              </w:rPr>
+              <w:t xml:space="preserve">김성민 (1인 수행)</w:t>
+            </w:r>
           </w:p>
         </w:tc>
       </w:tr>
@@ -1949,6 +2115,13 @@
             <w:pPr>
               <w:pStyle w:val="a3"/>
             </w:pPr>
+            <w:r>
+              <w:rPr>
+                <w:rFonts w:ascii="HY중고딕" w:eastAsia="HY중고딕" w:hAnsi="HY중고딕" w:cs="HY중고딕"/>
+                <w:sz w:val="20"/>
+              </w:rPr>
+              <w:t xml:space="preserve">한국어 화면 OCR 도구 비교(EasyOCR·PaddleOCR): 화면 폰트·저해상도에서의 한글 인식률 측정</w:t>
+            </w:r>
           </w:p>
         </w:tc>
         <w:tc>
@@ -1959,7 +2132,15 @@
           <w:p>
             <w:pPr>
               <w:pStyle w:val="a3"/>
-            </w:pPr>
+              <w:jc w:val="center"/>
+            </w:pPr>
+            <w:r>
+              <w:rPr>
+                <w:rFonts w:ascii="HY중고딕" w:eastAsia="HY중고딕" w:hAnsi="HY중고딕" w:cs="HY중고딕"/>
+                <w:sz w:val="20"/>
+              </w:rPr>
+              <w:t xml:space="preserve">9월 4주 ~ 10월 1주</w:t>
+            </w:r>
           </w:p>
         </w:tc>
         <w:tc>
@@ -1970,7 +2151,15 @@
           <w:p>
             <w:pPr>
               <w:pStyle w:val="a3"/>
-            </w:pPr>
+              <w:jc w:val="center"/>
+            </w:pPr>
+            <w:r>
+              <w:rPr>
+                <w:rFonts w:ascii="HY중고딕" w:eastAsia="HY중고딕" w:hAnsi="HY중고딕" w:cs="HY중고딕"/>
+                <w:sz w:val="20"/>
+              </w:rPr>
+              <w:t xml:space="preserve">김성민 (1인 수행)</w:t>
+            </w:r>
           </w:p>
         </w:tc>
       </w:tr>
@@ -2006,6 +2195,13 @@
             <w:pPr>
               <w:pStyle w:val="a3"/>
             </w:pPr>
+            <w:r>
+              <w:rPr>
+                <w:rFonts w:ascii="HY중고딕" w:eastAsia="HY중고딕" w:hAnsi="HY중고딕" w:cs="HY중고딕"/>
+                <w:sz w:val="20"/>
+              </w:rPr>
+              <w:t xml:space="preserve">데이터 수집·라벨링 기준 수립: 판정 기준서, 하드 네거티브 정의, 도메인 단위 분리, 메타데이터 기록, 수집 윤리·법적 범위 확인</w:t>
+            </w:r>
           </w:p>
         </w:tc>
         <w:tc>
@@ -2016,7 +2212,15 @@
           <w:p>
             <w:pPr>
               <w:pStyle w:val="a3"/>
-            </w:pPr>
+              <w:jc w:val="center"/>
+            </w:pPr>
+            <w:r>
+              <w:rPr>
+                <w:rFonts w:ascii="HY중고딕" w:eastAsia="HY중고딕" w:hAnsi="HY중고딕" w:cs="HY중고딕"/>
+                <w:sz w:val="20"/>
+              </w:rPr>
+              <w:t xml:space="preserve">10월 1주 ~ 10월 2주</w:t>
+            </w:r>
           </w:p>
         </w:tc>
         <w:tc>
@@ -2027,7 +2231,15 @@
           <w:p>
             <w:pPr>
               <w:pStyle w:val="a3"/>
-            </w:pPr>
+              <w:jc w:val="center"/>
+            </w:pPr>
+            <w:r>
+              <w:rPr>
+                <w:rFonts w:ascii="HY중고딕" w:eastAsia="HY중고딕" w:hAnsi="HY중고딕" w:cs="HY중고딕"/>
+                <w:sz w:val="20"/>
+              </w:rPr>
+              <w:t xml:space="preserve">김성민 (1인 수행)</w:t>
+            </w:r>
           </w:p>
         </w:tc>
       </w:tr>
@@ -2063,6 +2275,13 @@
             <w:pPr>
               <w:pStyle w:val="a3"/>
             </w:pPr>
+            <w:r>
+              <w:rPr>
+                <w:rFonts w:ascii="HY중고딕" w:eastAsia="HY중고딕" w:hAnsi="HY중고딕" w:cs="HY중고딕"/>
+                <w:sz w:val="20"/>
+              </w:rPr>
+              <w:t xml:space="preserve">텍스트 분류(KoBERT·KLUE-RoBERTa)와 이미지 분류(CNN·ViT) 모델 학습 및 평가</w:t>
+            </w:r>
           </w:p>
         </w:tc>
         <w:tc>
@@ -2073,7 +2292,15 @@
           <w:p>
             <w:pPr>
               <w:pStyle w:val="a3"/>
-            </w:pPr>
+              <w:jc w:val="center"/>
+            </w:pPr>
+            <w:r>
+              <w:rPr>
+                <w:rFonts w:ascii="HY중고딕" w:eastAsia="HY중고딕" w:hAnsi="HY중고딕" w:cs="HY중고딕"/>
+                <w:sz w:val="20"/>
+              </w:rPr>
+              <w:t xml:space="preserve">10월 2주 ~ 10월 4주</w:t>
+            </w:r>
           </w:p>
         </w:tc>
         <w:tc>
@@ -2084,7 +2311,15 @@
           <w:p>
             <w:pPr>
               <w:pStyle w:val="a3"/>
-            </w:pPr>
+              <w:jc w:val="center"/>
+            </w:pPr>
+            <w:r>
+              <w:rPr>
+                <w:rFonts w:ascii="HY중고딕" w:eastAsia="HY중고딕" w:hAnsi="HY중고딕" w:cs="HY중고딕"/>
+                <w:sz w:val="20"/>
+              </w:rPr>
+              <w:t xml:space="preserve">김성민 (1인 수행)</w:t>
+            </w:r>
           </w:p>
         </w:tc>
       </w:tr>
@@ -2120,6 +2355,13 @@
             <w:pPr>
               <w:pStyle w:val="a3"/>
             </w:pPr>
+            <w:r>
+              <w:rPr>
+                <w:rFonts w:ascii="HY중고딕" w:eastAsia="HY중고딕" w:hAnsi="HY중고딕" w:cs="HY중고딕"/>
+                <w:sz w:val="20"/>
+              </w:rPr>
+              <w:t xml:space="preserve">멀티모달 융합(early/late/cross-attention) 설계·비교 실험</w:t>
+            </w:r>
           </w:p>
         </w:tc>
         <w:tc>
@@ -2130,7 +2372,15 @@
           <w:p>
             <w:pPr>
               <w:pStyle w:val="a3"/>
-            </w:pPr>
+              <w:jc w:val="center"/>
+            </w:pPr>
+            <w:r>
+              <w:rPr>
+                <w:rFonts w:ascii="HY중고딕" w:eastAsia="HY중고딕" w:hAnsi="HY중고딕" w:cs="HY중고딕"/>
+                <w:sz w:val="20"/>
+              </w:rPr>
+              <w:t xml:space="preserve">10월 4주 ~ 11월 2주</w:t>
+            </w:r>
           </w:p>
         </w:tc>
         <w:tc>
@@ -2141,7 +2391,15 @@
           <w:p>
             <w:pPr>
               <w:pStyle w:val="a3"/>
-            </w:pPr>
+              <w:jc w:val="center"/>
+            </w:pPr>
+            <w:r>
+              <w:rPr>
+                <w:rFonts w:ascii="HY중고딕" w:eastAsia="HY중고딕" w:hAnsi="HY중고딕" w:cs="HY중고딕"/>
+                <w:sz w:val="20"/>
+              </w:rPr>
+              <w:t xml:space="preserve">김성민 (1인 수행)</w:t>
+            </w:r>
           </w:p>
         </w:tc>
       </w:tr>
@@ -2177,6 +2435,13 @@
             <w:pPr>
               <w:pStyle w:val="a3"/>
             </w:pPr>
+            <w:r>
+              <w:rPr>
+                <w:rFonts w:ascii="HY중고딕" w:eastAsia="HY중고딕" w:hAnsi="HY중고딕" w:cs="HY중고딕"/>
+                <w:sz w:val="20"/>
+              </w:rPr>
+              <w:t xml:space="preserve">모델 경량화(양자화·TFLite)와 안드로이드 온디바이스 추론 적용</w:t>
+            </w:r>
           </w:p>
         </w:tc>
         <w:tc>
@@ -2187,7 +2452,15 @@
           <w:p>
             <w:pPr>
               <w:pStyle w:val="a3"/>
-            </w:pPr>
+              <w:jc w:val="center"/>
+            </w:pPr>
+            <w:r>
+              <w:rPr>
+                <w:rFonts w:ascii="HY중고딕" w:eastAsia="HY중고딕" w:hAnsi="HY중고딕" w:cs="HY중고딕"/>
+                <w:sz w:val="20"/>
+              </w:rPr>
+              <w:t xml:space="preserve">11월 2주 ~ 11월 4주</w:t>
+            </w:r>
           </w:p>
         </w:tc>
         <w:tc>
@@ -2198,7 +2471,15 @@
           <w:p>
             <w:pPr>
               <w:pStyle w:val="a3"/>
-            </w:pPr>
+              <w:jc w:val="center"/>
+            </w:pPr>
+            <w:r>
+              <w:rPr>
+                <w:rFonts w:ascii="HY중고딕" w:eastAsia="HY중고딕" w:hAnsi="HY중고딕" w:cs="HY중고딕"/>
+                <w:sz w:val="20"/>
+              </w:rPr>
+              <w:t xml:space="preserve">김성민 (1인 수행)</w:t>
+            </w:r>
           </w:p>
         </w:tc>
       </w:tr>
@@ -2249,7 +2530,25 @@
           <w:sz w:val="28"/>
         </w:rPr>
         <w:lastRenderedPageBreak/>
-        <w:t xml:space="preserve">8. 공감 계획 — 현장방문 / 인터뷰 / 관찰 계획</w:t>
+        <w:t xml:space="preserve">8. 공감 계획 — </w:t>
+      </w:r>
+      <w:proofErr w:type="gramStart"/>
+      <w:r>
+        <w:rPr>
+          <w:rFonts w:ascii="휴먼명조" w:eastAsia="휴먼명조" w:hAnsi="휴먼명조" w:cs="휴먼명조"/>
+          <w:b/>
+          <w:sz w:val="28"/>
+        </w:rPr>
+        <w:t>현장방문 /</w:t>
+      </w:r>
+      <w:proofErr w:type="gramEnd"/>
+      <w:r>
+        <w:rPr>
+          <w:rFonts w:ascii="휴먼명조" w:eastAsia="휴먼명조" w:hAnsi="휴먼명조" w:cs="휴먼명조"/>
+          <w:b/>
+          <w:sz w:val="28"/>
+        </w:rPr>
+        <w:t xml:space="preserve"> 인터뷰 / 관찰 계획</w:t>
       </w:r>
     </w:p>
     <w:p>
@@ -2262,7 +2561,23 @@
           <w:rFonts w:ascii="HY중고딕" w:eastAsia="HY중고딕" w:hAnsi="HY중고딕" w:cs="HY중고딕"/>
           <w:color w:val="7F7F7F"/>
         </w:rPr>
-        <w:t xml:space="preserve">※ 역할은 질문자 / 관찰자 / 기록자를 조원 이름과 함께 기재한다.</w:t>
+        <w:t xml:space="preserve">※ 역할은 </w:t>
+      </w:r>
+      <w:proofErr w:type="gramStart"/>
+      <w:r>
+        <w:rPr>
+          <w:rFonts w:ascii="HY중고딕" w:eastAsia="HY중고딕" w:hAnsi="HY중고딕" w:cs="HY중고딕"/>
+          <w:color w:val="7F7F7F"/>
+        </w:rPr>
+        <w:t>질문자 /</w:t>
+      </w:r>
+      <w:proofErr w:type="gramEnd"/>
+      <w:r>
+        <w:rPr>
+          <w:rFonts w:ascii="HY중고딕" w:eastAsia="HY중고딕" w:hAnsi="HY중고딕" w:cs="HY중고딕"/>
+          <w:color w:val="7F7F7F"/>
+        </w:rPr>
+        <w:t xml:space="preserve"> 관찰자 / 기록자를 조원 이름과 함께 기재한다.</w:t>
       </w:r>
     </w:p>
     <w:tbl>
@@ -2478,6 +2793,13 @@
             <w:pPr>
               <w:pStyle w:val="a3"/>
             </w:pPr>
+            <w:r>
+              <w:rPr>
+                <w:rFonts w:ascii="HY중고딕" w:eastAsia="HY중고딕" w:hAnsi="HY중고딕" w:cs="HY중고딕"/>
+                <w:sz w:val="18"/>
+              </w:rPr>
+              <w:t xml:space="preserve">보호자 고충이 실제로 존재하는가 (차단 앱 실패·갈등 경험)</w:t>
+            </w:r>
           </w:p>
         </w:tc>
         <w:tc>
@@ -2489,6 +2811,13 @@
             <w:pPr>
               <w:pStyle w:val="a3"/>
             </w:pPr>
+            <w:r>
+              <w:rPr>
+                <w:rFonts w:ascii="HY중고딕" w:eastAsia="HY중고딕" w:hAnsi="HY중고딕" w:cs="HY중고딕"/>
+                <w:sz w:val="18"/>
+              </w:rPr>
+              <w:t xml:space="preserve">중·고생 학부모 3인 (징후 인지형 우선, 학부모 커뮤니티·지인 소개)</w:t>
+            </w:r>
           </w:p>
         </w:tc>
         <w:tc>
@@ -2500,6 +2829,13 @@
             <w:pPr>
               <w:pStyle w:val="a3"/>
             </w:pPr>
+            <w:r>
+              <w:rPr>
+                <w:rFonts w:ascii="HY중고딕" w:eastAsia="HY중고딕" w:hAnsi="HY중고딕" w:cs="HY중고딕"/>
+                <w:sz w:val="18"/>
+              </w:rPr>
+              <w:t xml:space="preserve">"자녀 폰 사용에서 가장 걱정됐던 순간은 언제였나요?" "차단 앱을 써 본 뒤 무슨 일이 있었나요?" "어떤 것을 알게 되면 안심이 되고, 어떤 것은 알고 싶지 않나요?"</w:t>
+            </w:r>
           </w:p>
         </w:tc>
         <w:tc>
@@ -2510,7 +2846,15 @@
           <w:p>
             <w:pPr>
               <w:pStyle w:val="a3"/>
-            </w:pPr>
+              <w:jc w:val="center"/>
+            </w:pPr>
+            <w:r>
+              <w:rPr>
+                <w:rFonts w:ascii="HY중고딕" w:eastAsia="HY중고딕" w:hAnsi="HY중고딕" w:cs="HY중고딕"/>
+                <w:sz w:val="18"/>
+              </w:rPr>
+              <w:t xml:space="preserve">10월 1주</w:t>
+            </w:r>
           </w:p>
         </w:tc>
         <w:tc>
@@ -2522,6 +2866,13 @@
             <w:pPr>
               <w:pStyle w:val="a3"/>
             </w:pPr>
+            <w:r>
+              <w:rPr>
+                <w:rFonts w:ascii="HY중고딕" w:eastAsia="HY중고딕" w:hAnsi="HY중고딕" w:cs="HY중고딕"/>
+                <w:sz w:val="18"/>
+              </w:rPr>
+              <w:t xml:space="preserve">김성민 (질문자·기록자)</w:t>
+            </w:r>
           </w:p>
         </w:tc>
       </w:tr>
@@ -2557,6 +2908,13 @@
             <w:pPr>
               <w:pStyle w:val="a3"/>
             </w:pPr>
+            <w:r>
+              <w:rPr>
+                <w:rFonts w:ascii="HY중고딕" w:eastAsia="HY중고딕" w:hAnsi="HY중고딕" w:cs="HY중고딕"/>
+                <w:sz w:val="18"/>
+              </w:rPr>
+              <w:t xml:space="preserve">보호자가 수용하는 알림 범위와 시점</w:t>
+            </w:r>
           </w:p>
         </w:tc>
         <w:tc>
@@ -2568,6 +2926,13 @@
             <w:pPr>
               <w:pStyle w:val="a3"/>
             </w:pPr>
+            <w:r>
+              <w:rPr>
+                <w:rFonts w:ascii="HY중고딕" w:eastAsia="HY중고딕" w:hAnsi="HY중고딕" w:cs="HY중고딕"/>
+                <w:sz w:val="18"/>
+              </w:rPr>
+              <w:t xml:space="preserve">위 학부모 3인 (같은 자리에서 진행)</w:t>
+            </w:r>
           </w:p>
         </w:tc>
         <w:tc>
@@ -2579,6 +2944,13 @@
             <w:pPr>
               <w:pStyle w:val="a3"/>
             </w:pPr>
+            <w:r>
+              <w:rPr>
+                <w:rFonts w:ascii="HY중고딕" w:eastAsia="HY중고딕" w:hAnsi="HY중고딕" w:cs="HY중고딕"/>
+                <w:sz w:val="18"/>
+              </w:rPr>
+              <w:t xml:space="preserve">페이퍼 프로토타입 화면 ④(충전 시도 알림)과 주간 요약 카드를 보여주고 "이 알림이 오면 무엇을 하시겠어요?" "어느 순간부터 감시처럼 느껴지나요?" 반응·표정 관찰</w:t>
+            </w:r>
           </w:p>
         </w:tc>
         <w:tc>
@@ -2589,7 +2961,15 @@
           <w:p>
             <w:pPr>
               <w:pStyle w:val="a3"/>
-            </w:pPr>
+              <w:jc w:val="center"/>
+            </w:pPr>
+            <w:r>
+              <w:rPr>
+                <w:rFonts w:ascii="HY중고딕" w:eastAsia="HY중고딕" w:hAnsi="HY중고딕" w:cs="HY중고딕"/>
+                <w:sz w:val="18"/>
+              </w:rPr>
+              <w:t xml:space="preserve">10월 1주</w:t>
+            </w:r>
           </w:p>
         </w:tc>
         <w:tc>
@@ -2601,6 +2981,13 @@
             <w:pPr>
               <w:pStyle w:val="a3"/>
             </w:pPr>
+            <w:r>
+              <w:rPr>
+                <w:rFonts w:ascii="HY중고딕" w:eastAsia="HY중고딕" w:hAnsi="HY중고딕" w:cs="HY중고딕"/>
+                <w:sz w:val="18"/>
+              </w:rPr>
+              <w:t xml:space="preserve">김성민 (질문자·관찰자)</w:t>
+            </w:r>
           </w:p>
         </w:tc>
       </w:tr>
@@ -2636,6 +3023,13 @@
             <w:pPr>
               <w:pStyle w:val="a3"/>
             </w:pPr>
+            <w:r>
+              <w:rPr>
+                <w:rFonts w:ascii="HY중고딕" w:eastAsia="HY중고딕" w:hAnsi="HY중고딕" w:cs="HY중고딕"/>
+                <w:sz w:val="18"/>
+              </w:rPr>
+              <w:t xml:space="preserve">청소년이 스스로 설치·유지할 조건 (수용성)</w:t>
+            </w:r>
           </w:p>
         </w:tc>
         <w:tc>
@@ -2647,6 +3041,13 @@
             <w:pPr>
               <w:pStyle w:val="a3"/>
             </w:pPr>
+            <w:r>
+              <w:rPr>
+                <w:rFonts w:ascii="HY중고딕" w:eastAsia="HY중고딕" w:hAnsi="HY중고딕" w:cs="HY중고딕"/>
+                <w:sz w:val="18"/>
+              </w:rPr>
+              <w:t xml:space="preserve">중3~고1 청소년 3인 (보호자 동의, 학교·지인 소개)</w:t>
+            </w:r>
           </w:p>
         </w:tc>
         <w:tc>
@@ -2658,6 +3059,13 @@
             <w:pPr>
               <w:pStyle w:val="a3"/>
             </w:pPr>
+            <w:r>
+              <w:rPr>
+                <w:rFonts w:ascii="HY중고딕" w:eastAsia="HY중고딕" w:hAnsi="HY중고딕" w:cs="HY중고딕"/>
+                <w:sz w:val="18"/>
+              </w:rPr>
+              <w:t xml:space="preserve">"부모님이 깔라고 하면 어떻게 하나요?" "내 폰을 지켜 주는 기능이라면 어떤 게 있어야 켜 두겠어요?" 온보딩 화면 ①을 직접 조작하게 하고 어떤 항목을 끄는지 관찰</w:t>
+            </w:r>
           </w:p>
         </w:tc>
         <w:tc>
@@ -2668,7 +3076,15 @@
           <w:p>
             <w:pPr>
               <w:pStyle w:val="a3"/>
-            </w:pPr>
+              <w:jc w:val="center"/>
+            </w:pPr>
+            <w:r>
+              <w:rPr>
+                <w:rFonts w:ascii="HY중고딕" w:eastAsia="HY중고딕" w:hAnsi="HY중고딕" w:cs="HY중고딕"/>
+                <w:sz w:val="18"/>
+              </w:rPr>
+              <w:t xml:space="preserve">10월 2주</w:t>
+            </w:r>
           </w:p>
         </w:tc>
         <w:tc>
@@ -2680,6 +3096,13 @@
             <w:pPr>
               <w:pStyle w:val="a3"/>
             </w:pPr>
+            <w:r>
+              <w:rPr>
+                <w:rFonts w:ascii="HY중고딕" w:eastAsia="HY중고딕" w:hAnsi="HY중고딕" w:cs="HY중고딕"/>
+                <w:sz w:val="18"/>
+              </w:rPr>
+              <w:t xml:space="preserve">김성민 (질문자·관찰자)</w:t>
+            </w:r>
           </w:p>
         </w:tc>
       </w:tr>
@@ -2715,6 +3138,13 @@
             <w:pPr>
               <w:pStyle w:val="a3"/>
             </w:pPr>
+            <w:r>
+              <w:rPr>
+                <w:rFonts w:ascii="HY중고딕" w:eastAsia="HY중고딕" w:hAnsi="HY중고딕" w:cs="HY중고딕"/>
+                <w:sz w:val="18"/>
+              </w:rPr>
+              <w:t xml:space="preserve">실제 노출 상황에서의 행동</w:t>
+            </w:r>
           </w:p>
         </w:tc>
         <w:tc>
@@ -2726,6 +3156,13 @@
             <w:pPr>
               <w:pStyle w:val="a3"/>
             </w:pPr>
+            <w:r>
+              <w:rPr>
+                <w:rFonts w:ascii="HY중고딕" w:eastAsia="HY중고딕" w:hAnsi="HY중고딕" w:cs="HY중고딕"/>
+                <w:sz w:val="18"/>
+              </w:rPr>
+              <w:t xml:space="preserve">위 청소년 중 2인 (동의 하에 화면 공유)</w:t>
+            </w:r>
           </w:p>
         </w:tc>
         <w:tc>
@@ -2737,6 +3174,13 @@
             <w:pPr>
               <w:pStyle w:val="a3"/>
             </w:pPr>
+            <w:r>
+              <w:rPr>
+                <w:rFonts w:ascii="HY중고딕" w:eastAsia="HY중고딕" w:hAnsi="HY중고딕" w:cs="HY중고딕"/>
+                <w:sz w:val="18"/>
+              </w:rPr>
+              <w:t xml:space="preserve">무료 스포츠 중계 시청 10분 동안 어떤 배너가 뜨고 어떻게 반응하는지(닫기·무시·클릭) 관찰. "방금 닫은 건 뭐라고 생각했어요?"</w:t>
+            </w:r>
           </w:p>
         </w:tc>
         <w:tc>
@@ -2747,7 +3191,15 @@
           <w:p>
             <w:pPr>
               <w:pStyle w:val="a3"/>
-            </w:pPr>
+              <w:jc w:val="center"/>
+            </w:pPr>
+            <w:r>
+              <w:rPr>
+                <w:rFonts w:ascii="HY중고딕" w:eastAsia="HY중고딕" w:hAnsi="HY중고딕" w:cs="HY중고딕"/>
+                <w:sz w:val="18"/>
+              </w:rPr>
+              <w:t xml:space="preserve">10월 2주</w:t>
+            </w:r>
           </w:p>
         </w:tc>
         <w:tc>
@@ -2759,6 +3211,13 @@
             <w:pPr>
               <w:pStyle w:val="a3"/>
             </w:pPr>
+            <w:r>
+              <w:rPr>
+                <w:rFonts w:ascii="HY중고딕" w:eastAsia="HY중고딕" w:hAnsi="HY중고딕" w:cs="HY중고딕"/>
+                <w:sz w:val="18"/>
+              </w:rPr>
+              <w:t xml:space="preserve">김성민 (관찰자·기록자)</w:t>
+            </w:r>
           </w:p>
         </w:tc>
       </w:tr>
@@ -2794,6 +3253,13 @@
             <w:pPr>
               <w:pStyle w:val="a3"/>
             </w:pPr>
+            <w:r>
+              <w:rPr>
+                <w:rFonts w:ascii="HY중고딕" w:eastAsia="HY중고딕" w:hAnsi="HY중고딕" w:cs="HY중고딕"/>
+                <w:sz w:val="18"/>
+              </w:rPr>
+              <w:t xml:space="preserve">정상 게임과 도박을 가르는 기준 (오탐 허용선)</w:t>
+            </w:r>
           </w:p>
         </w:tc>
         <w:tc>
@@ -2805,6 +3271,13 @@
             <w:pPr>
               <w:pStyle w:val="a3"/>
             </w:pPr>
+            <w:r>
+              <w:rPr>
+                <w:rFonts w:ascii="HY중고딕" w:eastAsia="HY중고딕" w:hAnsi="HY중고딕" w:cs="HY중고딕"/>
+                <w:sz w:val="18"/>
+              </w:rPr>
+              <w:t xml:space="preserve">청소년 3인 + 학부모 3인</w:t>
+            </w:r>
           </w:p>
         </w:tc>
         <w:tc>
@@ -2816,6 +3289,13 @@
             <w:pPr>
               <w:pStyle w:val="a3"/>
             </w:pPr>
+            <w:r>
+              <w:rPr>
+                <w:rFonts w:ascii="HY중고딕" w:eastAsia="HY중고딕" w:hAnsi="HY중고딕" w:cs="HY중고딕"/>
+                <w:sz w:val="18"/>
+              </w:rPr>
+              <w:t xml:space="preserve">실제 캡처 20장(도박 충전 화면·모바일 게임 인앱결제·공식 토토 앱·쇼핑 결제)을 보여주고 "이 화면은 막혀야 하나요?" 분류하게 한 뒤 이유를 묻기</w:t>
+            </w:r>
           </w:p>
         </w:tc>
         <w:tc>
@@ -2826,7 +3306,15 @@
           <w:p>
             <w:pPr>
               <w:pStyle w:val="a3"/>
-            </w:pPr>
+              <w:jc w:val="center"/>
+            </w:pPr>
+            <w:r>
+              <w:rPr>
+                <w:rFonts w:ascii="HY중고딕" w:eastAsia="HY중고딕" w:hAnsi="HY중고딕" w:cs="HY중고딕"/>
+                <w:sz w:val="18"/>
+              </w:rPr>
+              <w:t xml:space="preserve">10월 2주</w:t>
+            </w:r>
           </w:p>
         </w:tc>
         <w:tc>
@@ -2838,6 +3326,13 @@
             <w:pPr>
               <w:pStyle w:val="a3"/>
             </w:pPr>
+            <w:r>
+              <w:rPr>
+                <w:rFonts w:ascii="HY중고딕" w:eastAsia="HY중고딕" w:hAnsi="HY중고딕" w:cs="HY중고딕"/>
+                <w:sz w:val="18"/>
+              </w:rPr>
+              <w:t xml:space="preserve">김성민 (질문자·기록자)</w:t>
+            </w:r>
           </w:p>
         </w:tc>
       </w:tr>
@@ -2873,6 +3368,13 @@
             <w:pPr>
               <w:pStyle w:val="a3"/>
             </w:pPr>
+            <w:r>
+              <w:rPr>
+                <w:rFonts w:ascii="HY중고딕" w:eastAsia="HY중고딕" w:hAnsi="HY중고딕" w:cs="HY중고딕"/>
+                <w:sz w:val="18"/>
+              </w:rPr>
+              <w:t xml:space="preserve">현장 대응자가 본 최초 노출 경로와 첫 충전 수단</w:t>
+            </w:r>
           </w:p>
         </w:tc>
         <w:tc>
@@ -2884,6 +3386,13 @@
             <w:pPr>
               <w:pStyle w:val="a3"/>
             </w:pPr>
+            <w:r>
+              <w:rPr>
+                <w:rFonts w:ascii="HY중고딕" w:eastAsia="HY중고딕" w:hAnsi="HY중고딕" w:cs="HY중고딕"/>
+                <w:sz w:val="18"/>
+              </w:rPr>
+              <w:t xml:space="preserve">Wee클래스 상담교사 또는 1336 상담사 1~2인</w:t>
+            </w:r>
           </w:p>
         </w:tc>
         <w:tc>
@@ -2895,6 +3404,13 @@
             <w:pPr>
               <w:pStyle w:val="a3"/>
             </w:pPr>
+            <w:r>
+              <w:rPr>
+                <w:rFonts w:ascii="HY중고딕" w:eastAsia="HY중고딕" w:hAnsi="HY중고딕" w:cs="HY중고딕"/>
+                <w:sz w:val="18"/>
+              </w:rPr>
+              <w:t xml:space="preserve">"상담에 온 청소년은 처음 어디서 도박 화면을 봤다고 하나요?" "첫 충전은 어떤 수단이었나요?" "보호자에게 충전 시도 알림이 가면 개입에 도움이 될까요, 방해가 될까요?"</w:t>
+            </w:r>
           </w:p>
         </w:tc>
         <w:tc>
@@ -2905,7 +3421,15 @@
           <w:p>
             <w:pPr>
               <w:pStyle w:val="a3"/>
-            </w:pPr>
+              <w:jc w:val="center"/>
+            </w:pPr>
+            <w:r>
+              <w:rPr>
+                <w:rFonts w:ascii="HY중고딕" w:eastAsia="HY중고딕" w:hAnsi="HY중고딕" w:cs="HY중고딕"/>
+                <w:sz w:val="18"/>
+              </w:rPr>
+              <w:t xml:space="preserve">10월 3주</w:t>
+            </w:r>
           </w:p>
         </w:tc>
         <w:tc>
@@ -2917,6 +3441,13 @@
             <w:pPr>
               <w:pStyle w:val="a3"/>
             </w:pPr>
+            <w:r>
+              <w:rPr>
+                <w:rFonts w:ascii="HY중고딕" w:eastAsia="HY중고딕" w:hAnsi="HY중고딕" w:cs="HY중고딕"/>
+                <w:sz w:val="18"/>
+              </w:rPr>
+              <w:t xml:space="preserve">김성민 (질문자·기록자)</w:t>
+            </w:r>
           </w:p>
         </w:tc>
       </w:tr>
@@ -3080,7 +3611,7 @@
                 <w:rFonts w:ascii="HY중고딕" w:eastAsia="HY중고딕" w:hAnsi="HY중고딕" w:cs="HY중고딕"/>
                 <w:sz w:val="24"/>
               </w:rPr>
-              <w:t>☐</w:t>
+              <w:t>☑</w:t>
             </w:r>
           </w:p>
         </w:tc>
@@ -3103,7 +3634,23 @@
                 <w:rFonts w:ascii="HY중고딕" w:eastAsia="HY중고딕" w:hAnsi="HY중고딕" w:cs="HY중고딕"/>
                 <w:sz w:val="21"/>
               </w:rPr>
-              <w:t xml:space="preserve">제목이 프로젝트 주제를 바로 알 수 있게 작명되었는가?</w:t>
+              <w:t xml:space="preserve">제목이 프로젝트 주제를 바로 알 수 있게 </w:t>
+            </w:r>
+            <w:proofErr w:type="spellStart"/>
+            <w:r>
+              <w:rPr>
+                <w:rFonts w:ascii="HY중고딕" w:eastAsia="HY중고딕" w:hAnsi="HY중고딕" w:cs="HY중고딕"/>
+                <w:sz w:val="21"/>
+              </w:rPr>
+              <w:t>작명되었는가</w:t>
+            </w:r>
+            <w:proofErr w:type="spellEnd"/>
+            <w:r>
+              <w:rPr>
+                <w:rFonts w:ascii="HY중고딕" w:eastAsia="HY중고딕" w:hAnsi="HY중고딕" w:cs="HY중고딕"/>
+                <w:sz w:val="21"/>
+              </w:rPr>
+              <w:t>?</w:t>
             </w:r>
           </w:p>
         </w:tc>
@@ -3122,7 +3669,7 @@
                 <w:rFonts w:ascii="HY중고딕" w:eastAsia="HY중고딕" w:hAnsi="HY중고딕" w:cs="HY중고딕"/>
                 <w:sz w:val="24"/>
               </w:rPr>
-              <w:t>☐</w:t>
+              <w:t>☑</w:t>
             </w:r>
           </w:p>
         </w:tc>
@@ -3164,7 +3711,7 @@
                 <w:rFonts w:ascii="HY중고딕" w:eastAsia="HY중고딕" w:hAnsi="HY중고딕" w:cs="HY중고딕"/>
                 <w:sz w:val="24"/>
               </w:rPr>
-              <w:t>☐</w:t>
+              <w:t>☑</w:t>
             </w:r>
           </w:p>
         </w:tc>
@@ -3206,7 +3753,7 @@
                 <w:rFonts w:ascii="HY중고딕" w:eastAsia="HY중고딕" w:hAnsi="HY중고딕" w:cs="HY중고딕"/>
                 <w:sz w:val="24"/>
               </w:rPr>
-              <w:t>☐</w:t>
+              <w:t>☑</w:t>
             </w:r>
           </w:p>
         </w:tc>
@@ -3229,7 +3776,23 @@
                 <w:rFonts w:ascii="HY중고딕" w:eastAsia="HY중고딕" w:hAnsi="HY중고딕" w:cs="HY중고딕"/>
                 <w:sz w:val="21"/>
               </w:rPr>
-              <w:t xml:space="preserve">고충·니즈별로 "왜 해결해야 하는가"(이유)가 연결되어 있는가?</w:t>
+              <w:t>고충·</w:t>
+            </w:r>
+            <w:proofErr w:type="spellStart"/>
+            <w:r>
+              <w:rPr>
+                <w:rFonts w:ascii="HY중고딕" w:eastAsia="HY중고딕" w:hAnsi="HY중고딕" w:cs="HY중고딕"/>
+                <w:sz w:val="21"/>
+              </w:rPr>
+              <w:t>니즈별로</w:t>
+            </w:r>
+            <w:proofErr w:type="spellEnd"/>
+            <w:r>
+              <w:rPr>
+                <w:rFonts w:ascii="HY중고딕" w:eastAsia="HY중고딕" w:hAnsi="HY중고딕" w:cs="HY중고딕"/>
+                <w:sz w:val="21"/>
+              </w:rPr>
+              <w:t xml:space="preserve"> "왜 해결해야 하는가"(이유)가 연결되어 있는가?</w:t>
             </w:r>
           </w:p>
         </w:tc>
@@ -3248,7 +3811,7 @@
                 <w:rFonts w:ascii="HY중고딕" w:eastAsia="HY중고딕" w:hAnsi="HY중고딕" w:cs="HY중고딕"/>
                 <w:sz w:val="24"/>
               </w:rPr>
-              <w:t>☐</w:t>
+              <w:t>☑</w:t>
             </w:r>
           </w:p>
         </w:tc>
@@ -3290,7 +3853,7 @@
                 <w:rFonts w:ascii="HY중고딕" w:eastAsia="HY중고딕" w:hAnsi="HY중고딕" w:cs="HY중고딕"/>
                 <w:sz w:val="24"/>
               </w:rPr>
-              <w:t>☐</w:t>
+              <w:t>☑</w:t>
             </w:r>
           </w:p>
         </w:tc>
@@ -3332,7 +3895,7 @@
                 <w:rFonts w:ascii="HY중고딕" w:eastAsia="HY중고딕" w:hAnsi="HY중고딕" w:cs="HY중고딕"/>
                 <w:sz w:val="24"/>
               </w:rPr>
-              <w:t>☐</w:t>
+              <w:t>☑</w:t>
             </w:r>
           </w:p>
         </w:tc>
@@ -3374,7 +3937,7 @@
                 <w:rFonts w:ascii="HY중고딕" w:eastAsia="HY중고딕" w:hAnsi="HY중고딕" w:cs="HY중고딕"/>
                 <w:sz w:val="24"/>
               </w:rPr>
-              <w:t>☐</w:t>
+              <w:t>☑</w:t>
             </w:r>
           </w:p>
         </w:tc>
@@ -3416,7 +3979,7 @@
                 <w:rFonts w:ascii="HY중고딕" w:eastAsia="HY중고딕" w:hAnsi="HY중고딕" w:cs="HY중고딕"/>
                 <w:sz w:val="24"/>
               </w:rPr>
-              <w:t>☐</w:t>
+              <w:t>☑</w:t>
             </w:r>
           </w:p>
         </w:tc>
@@ -3475,1039 +4038,6 @@
         </w:rPr>
         <w:br w:type="page"/>
       </w:r>
-    </w:p>
-    <w:p>
-      <w:pPr>
-        <w:pStyle w:val="a3"/>
-        <w:spacing w:after="120"/>
-      </w:pPr>
-      <w:r>
-        <w:rPr>
-          <w:rFonts w:ascii="휴먼명조" w:eastAsia="휴먼명조" w:hAnsi="휴먼명조" w:cs="휴먼명조"/>
-          <w:b/>
-          <w:sz w:val="28"/>
-        </w:rPr>
-        <w:lastRenderedPageBreak/>
-        <w:t>[부록] 작성 가이드</w:t>
-      </w:r>
-    </w:p>
-    <w:p>
-      <w:pPr>
-        <w:pStyle w:val="a3"/>
-        <w:spacing w:after="200"/>
-      </w:pPr>
-      <w:r>
-        <w:rPr>
-          <w:rFonts w:ascii="HY중고딕" w:eastAsia="HY중고딕" w:hAnsi="HY중고딕" w:cs="HY중고딕"/>
-          <w:color w:val="C00000"/>
-          <w:sz w:val="21"/>
-        </w:rPr>
-        <w:t>※ 아래 가이드는 제출 시 이 페이지부터 끝까지 모두 삭제하십시오. 본문에는 가이드 상자를 두지 않았으므로 섹션마다 지울 필요가 없습니다.</w:t>
-      </w:r>
-    </w:p>
-    <w:tbl>
-      <w:tblPr>
-        <w:tblW w:w="10158" w:type="dxa"/>
-        <w:tblInd w:w="102" w:type="dxa"/>
-        <w:tblBorders>
-          <w:top w:val="single" w:sz="3" w:space="0" w:color="000000"/>
-          <w:left w:val="single" w:sz="3" w:space="0" w:color="000000"/>
-          <w:bottom w:val="single" w:sz="3" w:space="0" w:color="000000"/>
-          <w:right w:val="single" w:sz="3" w:space="0" w:color="000000"/>
-        </w:tblBorders>
-        <w:tblLayout w:type="fixed"/>
-        <w:tblCellMar>
-          <w:top w:w="57" w:type="dxa"/>
-          <w:left w:w="102" w:type="dxa"/>
-          <w:bottom w:w="57" w:type="dxa"/>
-          <w:right w:w="102" w:type="dxa"/>
-        </w:tblCellMar>
-        <w:tblLook w:val="04A0" w:firstRow="1" w:lastRow="0" w:firstColumn="1" w:lastColumn="0" w:noHBand="0" w:noVBand="1"/>
-      </w:tblPr>
-      <w:tblGrid>
-        <w:gridCol w:w="10158"/>
-      </w:tblGrid>
-      <w:tr>
-        <w:trPr>
-          <w:trHeight w:val="370"/>
-        </w:trPr>
-        <w:tc>
-          <w:tcPr>
-            <w:tcW w:w="10158" w:type="dxa"/>
-            <w:shd w:val="clear" w:color="auto" w:fill="DFDFDF"/>
-            <w:vAlign w:val="center"/>
-          </w:tcPr>
-          <w:p>
-            <w:pPr>
-              <w:pStyle w:val="a3"/>
-              <w:jc w:val="center"/>
-            </w:pPr>
-            <w:r>
-              <w:rPr>
-                <w:rFonts w:ascii="HY중고딕" w:eastAsia="HY중고딕" w:hAnsi="HY중고딕" w:cs="HY중고딕"/>
-                <w:b/>
-                <w:sz w:val="22"/>
-              </w:rPr>
-              <w:t>1. 프로젝트 제목과 선정 배경</w:t>
-            </w:r>
-          </w:p>
-        </w:tc>
-      </w:tr>
-      <w:tr>
-        <w:tc>
-          <w:tcPr>
-            <w:tcW w:w="10158" w:type="dxa"/>
-            <w:shd w:val="clear" w:color="auto" w:fill="F2F2F2"/>
-          </w:tcPr>
-          <w:p>
-            <w:pPr>
-              <w:pStyle w:val="a3"/>
-              <w:spacing w:line="312" w:lineRule="auto"/>
-              <w:ind w:left="200" w:hanging="200"/>
-            </w:pPr>
-            <w:r>
-              <w:rPr>
-                <w:rFonts w:ascii="HY중고딕" w:eastAsia="HY중고딕" w:hAnsi="HY중고딕" w:cs="HY중고딕"/>
-                <w:sz w:val="21"/>
-              </w:rPr>
-              <w:t>‣ 프로젝트 주제를 잘 나타낼 수 있는 이름으로 작명</w:t>
-            </w:r>
-          </w:p>
-          <w:p>
-            <w:pPr>
-              <w:pStyle w:val="a3"/>
-              <w:spacing w:line="312" w:lineRule="auto"/>
-              <w:ind w:left="200" w:hanging="200"/>
-            </w:pPr>
-            <w:r>
-              <w:rPr>
-                <w:rFonts w:ascii="HY중고딕" w:eastAsia="HY중고딕" w:hAnsi="HY중고딕" w:cs="HY중고딕"/>
-                <w:sz w:val="21"/>
-              </w:rPr>
-              <w:t>‣ 제안하는 프로젝트를 수행하려고 하는 배경과 필요성은 무엇인가?</w:t>
-            </w:r>
-          </w:p>
-        </w:tc>
-      </w:tr>
-    </w:tbl>
-    <w:p>
-      <w:pPr>
-        <w:pStyle w:val="a3"/>
-      </w:pPr>
-    </w:p>
-    <w:tbl>
-      <w:tblPr>
-        <w:tblW w:w="10158" w:type="dxa"/>
-        <w:tblInd w:w="102" w:type="dxa"/>
-        <w:tblBorders>
-          <w:top w:val="single" w:sz="3" w:space="0" w:color="000000"/>
-          <w:left w:val="single" w:sz="3" w:space="0" w:color="000000"/>
-          <w:bottom w:val="single" w:sz="3" w:space="0" w:color="000000"/>
-          <w:right w:val="single" w:sz="3" w:space="0" w:color="000000"/>
-        </w:tblBorders>
-        <w:tblLayout w:type="fixed"/>
-        <w:tblCellMar>
-          <w:top w:w="57" w:type="dxa"/>
-          <w:left w:w="102" w:type="dxa"/>
-          <w:bottom w:w="57" w:type="dxa"/>
-          <w:right w:w="102" w:type="dxa"/>
-        </w:tblCellMar>
-        <w:tblLook w:val="04A0" w:firstRow="1" w:lastRow="0" w:firstColumn="1" w:lastColumn="0" w:noHBand="0" w:noVBand="1"/>
-      </w:tblPr>
-      <w:tblGrid>
-        <w:gridCol w:w="10158"/>
-      </w:tblGrid>
-      <w:tr>
-        <w:trPr>
-          <w:trHeight w:val="370"/>
-        </w:trPr>
-        <w:tc>
-          <w:tcPr>
-            <w:tcW w:w="10158" w:type="dxa"/>
-            <w:shd w:val="clear" w:color="auto" w:fill="DFDFDF"/>
-            <w:vAlign w:val="center"/>
-          </w:tcPr>
-          <w:p>
-            <w:pPr>
-              <w:pStyle w:val="a3"/>
-              <w:jc w:val="center"/>
-            </w:pPr>
-            <w:r>
-              <w:rPr>
-                <w:rFonts w:ascii="HY중고딕" w:eastAsia="HY중고딕" w:hAnsi="HY중고딕" w:cs="HY중고딕"/>
-                <w:b/>
-                <w:sz w:val="22"/>
-              </w:rPr>
-              <w:t>2. 대상 이해당사자(stakeholder)</w:t>
-            </w:r>
-          </w:p>
-        </w:tc>
-      </w:tr>
-      <w:tr>
-        <w:tc>
-          <w:tcPr>
-            <w:tcW w:w="10158" w:type="dxa"/>
-            <w:shd w:val="clear" w:color="auto" w:fill="F2F2F2"/>
-          </w:tcPr>
-          <w:p>
-            <w:pPr>
-              <w:pStyle w:val="a3"/>
-              <w:spacing w:line="312" w:lineRule="auto"/>
-              <w:ind w:left="200" w:hanging="200"/>
-            </w:pPr>
-            <w:r>
-              <w:rPr>
-                <w:rFonts w:ascii="HY중고딕" w:eastAsia="HY중고딕" w:hAnsi="HY중고딕" w:cs="HY중고딕"/>
-                <w:sz w:val="21"/>
-              </w:rPr>
-              <w:t>◦ 프로젝트의 대상 이해당사자(목표 고객/타겟 사용자/관리자 등)를 기술</w:t>
-            </w:r>
-          </w:p>
-          <w:p>
-            <w:pPr>
-              <w:pStyle w:val="a3"/>
-              <w:spacing w:line="312" w:lineRule="auto"/>
-              <w:ind w:left="520" w:hanging="200"/>
-            </w:pPr>
-            <w:r>
-              <w:rPr>
-                <w:rFonts w:ascii="HY중고딕" w:eastAsia="HY중고딕" w:hAnsi="HY중고딕" w:cs="HY중고딕"/>
-                <w:sz w:val="21"/>
-              </w:rPr>
-              <w:t>‣ 어떤 고객/사용자를 위해 프로젝트를 설계하는가?</w:t>
-            </w:r>
-          </w:p>
-          <w:p>
-            <w:pPr>
-              <w:pStyle w:val="a3"/>
-              <w:spacing w:line="312" w:lineRule="auto"/>
-              <w:ind w:left="520" w:hanging="200"/>
-            </w:pPr>
-            <w:r>
-              <w:rPr>
-                <w:rFonts w:ascii="HY중고딕" w:eastAsia="HY중고딕" w:hAnsi="HY중고딕" w:cs="HY중고딕"/>
-                <w:sz w:val="21"/>
-              </w:rPr>
-              <w:t>‣ 설계 과정에서 어떤 사람들을 이해해야 하는가?</w:t>
-            </w:r>
-          </w:p>
-        </w:tc>
-      </w:tr>
-    </w:tbl>
-    <w:p>
-      <w:pPr>
-        <w:pStyle w:val="a3"/>
-      </w:pPr>
-    </w:p>
-    <w:tbl>
-      <w:tblPr>
-        <w:tblW w:w="10158" w:type="dxa"/>
-        <w:tblInd w:w="102" w:type="dxa"/>
-        <w:tblBorders>
-          <w:top w:val="single" w:sz="3" w:space="0" w:color="000000"/>
-          <w:left w:val="single" w:sz="3" w:space="0" w:color="000000"/>
-          <w:bottom w:val="single" w:sz="3" w:space="0" w:color="000000"/>
-          <w:right w:val="single" w:sz="3" w:space="0" w:color="000000"/>
-        </w:tblBorders>
-        <w:tblLayout w:type="fixed"/>
-        <w:tblCellMar>
-          <w:top w:w="57" w:type="dxa"/>
-          <w:left w:w="102" w:type="dxa"/>
-          <w:bottom w:w="57" w:type="dxa"/>
-          <w:right w:w="102" w:type="dxa"/>
-        </w:tblCellMar>
-        <w:tblLook w:val="04A0" w:firstRow="1" w:lastRow="0" w:firstColumn="1" w:lastColumn="0" w:noHBand="0" w:noVBand="1"/>
-      </w:tblPr>
-      <w:tblGrid>
-        <w:gridCol w:w="10158"/>
-      </w:tblGrid>
-      <w:tr>
-        <w:trPr>
-          <w:trHeight w:val="370"/>
-        </w:trPr>
-        <w:tc>
-          <w:tcPr>
-            <w:tcW w:w="10158" w:type="dxa"/>
-            <w:shd w:val="clear" w:color="auto" w:fill="DFDFDF"/>
-            <w:vAlign w:val="center"/>
-          </w:tcPr>
-          <w:p>
-            <w:pPr>
-              <w:pStyle w:val="a3"/>
-              <w:jc w:val="center"/>
-            </w:pPr>
-            <w:r>
-              <w:rPr>
-                <w:rFonts w:ascii="HY중고딕" w:eastAsia="HY중고딕" w:hAnsi="HY중고딕" w:cs="HY중고딕"/>
-                <w:b/>
-                <w:sz w:val="22"/>
-              </w:rPr>
-              <w:t>3. 이해당사자의 고충(pain point) 또는 니즈(needs)</w:t>
-            </w:r>
-          </w:p>
-        </w:tc>
-      </w:tr>
-      <w:tr>
-        <w:tc>
-          <w:tcPr>
-            <w:tcW w:w="10158" w:type="dxa"/>
-            <w:shd w:val="clear" w:color="auto" w:fill="F2F2F2"/>
-          </w:tcPr>
-          <w:p>
-            <w:pPr>
-              <w:pStyle w:val="a3"/>
-              <w:spacing w:line="312" w:lineRule="auto"/>
-              <w:ind w:left="200" w:hanging="200"/>
-            </w:pPr>
-            <w:r>
-              <w:rPr>
-                <w:rFonts w:ascii="HY중고딕" w:eastAsia="HY중고딕" w:hAnsi="HY중고딕" w:cs="HY중고딕"/>
-                <w:sz w:val="21"/>
-              </w:rPr>
-              <w:t>‣ 이해당사자가 겪는 고충(pain point)은 무엇인가?</w:t>
-            </w:r>
-          </w:p>
-          <w:p>
-            <w:pPr>
-              <w:pStyle w:val="a3"/>
-              <w:spacing w:line="312" w:lineRule="auto"/>
-              <w:ind w:left="200" w:hanging="200"/>
-            </w:pPr>
-            <w:r>
-              <w:rPr>
-                <w:rFonts w:ascii="HY중고딕" w:eastAsia="HY중고딕" w:hAnsi="HY중고딕" w:cs="HY중고딕"/>
-                <w:sz w:val="21"/>
-              </w:rPr>
-              <w:t>‣ 이해당사자가 원하는 것(needs)은 무엇인가?</w:t>
-            </w:r>
-          </w:p>
-          <w:p>
-            <w:pPr>
-              <w:pStyle w:val="a3"/>
-              <w:spacing w:line="312" w:lineRule="auto"/>
-              <w:ind w:left="200" w:hanging="200"/>
-            </w:pPr>
-            <w:r>
-              <w:rPr>
-                <w:rFonts w:ascii="HY중고딕" w:eastAsia="HY중고딕" w:hAnsi="HY중고딕" w:cs="HY중고딕"/>
-                <w:sz w:val="21"/>
-              </w:rPr>
-              <w:t>‣ 이해당사자의 단어와 표현을 그대로 사용하여 기술하면 좋다.</w:t>
-            </w:r>
-          </w:p>
-        </w:tc>
-      </w:tr>
-    </w:tbl>
-    <w:p>
-      <w:pPr>
-        <w:pStyle w:val="a3"/>
-      </w:pPr>
-    </w:p>
-    <w:tbl>
-      <w:tblPr>
-        <w:tblW w:w="10158" w:type="dxa"/>
-        <w:tblInd w:w="102" w:type="dxa"/>
-        <w:tblBorders>
-          <w:top w:val="single" w:sz="3" w:space="0" w:color="000000"/>
-          <w:left w:val="single" w:sz="3" w:space="0" w:color="000000"/>
-          <w:bottom w:val="single" w:sz="3" w:space="0" w:color="000000"/>
-          <w:right w:val="single" w:sz="3" w:space="0" w:color="000000"/>
-        </w:tblBorders>
-        <w:tblLayout w:type="fixed"/>
-        <w:tblCellMar>
-          <w:top w:w="57" w:type="dxa"/>
-          <w:left w:w="102" w:type="dxa"/>
-          <w:bottom w:w="57" w:type="dxa"/>
-          <w:right w:w="102" w:type="dxa"/>
-        </w:tblCellMar>
-        <w:tblLook w:val="04A0" w:firstRow="1" w:lastRow="0" w:firstColumn="1" w:lastColumn="0" w:noHBand="0" w:noVBand="1"/>
-      </w:tblPr>
-      <w:tblGrid>
-        <w:gridCol w:w="10158"/>
-      </w:tblGrid>
-      <w:tr>
-        <w:trPr>
-          <w:trHeight w:val="370"/>
-        </w:trPr>
-        <w:tc>
-          <w:tcPr>
-            <w:tcW w:w="10158" w:type="dxa"/>
-            <w:shd w:val="clear" w:color="auto" w:fill="DFDFDF"/>
-            <w:vAlign w:val="center"/>
-          </w:tcPr>
-          <w:p>
-            <w:pPr>
-              <w:pStyle w:val="a3"/>
-              <w:jc w:val="center"/>
-            </w:pPr>
-            <w:r>
-              <w:rPr>
-                <w:rFonts w:ascii="HY중고딕" w:eastAsia="HY중고딕" w:hAnsi="HY중고딕" w:cs="HY중고딕"/>
-                <w:b/>
-                <w:sz w:val="22"/>
-              </w:rPr>
-              <w:t>4. 이해당사자가 문제 해결을 원하는 이유</w:t>
-            </w:r>
-          </w:p>
-        </w:tc>
-      </w:tr>
-      <w:tr>
-        <w:tc>
-          <w:tcPr>
-            <w:tcW w:w="10158" w:type="dxa"/>
-            <w:shd w:val="clear" w:color="auto" w:fill="F2F2F2"/>
-          </w:tcPr>
-          <w:p>
-            <w:pPr>
-              <w:pStyle w:val="a3"/>
-              <w:spacing w:line="312" w:lineRule="auto"/>
-              <w:ind w:left="200" w:hanging="200"/>
-            </w:pPr>
-            <w:r>
-              <w:rPr>
-                <w:rFonts w:ascii="HY중고딕" w:eastAsia="HY중고딕" w:hAnsi="HY중고딕" w:cs="HY중고딕"/>
-                <w:sz w:val="21"/>
-              </w:rPr>
-              <w:t>‣ 이해당사자는 왜 이 문제가 해결되길 원하는가?</w:t>
-            </w:r>
-          </w:p>
-          <w:p>
-            <w:pPr>
-              <w:pStyle w:val="a3"/>
-              <w:spacing w:line="312" w:lineRule="auto"/>
-              <w:ind w:left="200" w:hanging="200"/>
-            </w:pPr>
-            <w:r>
-              <w:rPr>
-                <w:rFonts w:ascii="HY중고딕" w:eastAsia="HY중고딕" w:hAnsi="HY중고딕" w:cs="HY중고딕"/>
-                <w:sz w:val="21"/>
-              </w:rPr>
-              <w:t>‣ 이해당사자에게 그것이 중요한 이유는 무엇인가?</w:t>
-            </w:r>
-          </w:p>
-        </w:tc>
-      </w:tr>
-    </w:tbl>
-    <w:p>
-      <w:pPr>
-        <w:pStyle w:val="a3"/>
-      </w:pPr>
-    </w:p>
-    <w:tbl>
-      <w:tblPr>
-        <w:tblW w:w="10158" w:type="dxa"/>
-        <w:tblInd w:w="102" w:type="dxa"/>
-        <w:tblBorders>
-          <w:top w:val="single" w:sz="3" w:space="0" w:color="000000"/>
-          <w:left w:val="single" w:sz="3" w:space="0" w:color="000000"/>
-          <w:bottom w:val="single" w:sz="3" w:space="0" w:color="000000"/>
-          <w:right w:val="single" w:sz="3" w:space="0" w:color="000000"/>
-        </w:tblBorders>
-        <w:tblLayout w:type="fixed"/>
-        <w:tblCellMar>
-          <w:top w:w="57" w:type="dxa"/>
-          <w:left w:w="102" w:type="dxa"/>
-          <w:bottom w:w="57" w:type="dxa"/>
-          <w:right w:w="102" w:type="dxa"/>
-        </w:tblCellMar>
-        <w:tblLook w:val="04A0" w:firstRow="1" w:lastRow="0" w:firstColumn="1" w:lastColumn="0" w:noHBand="0" w:noVBand="1"/>
-      </w:tblPr>
-      <w:tblGrid>
-        <w:gridCol w:w="10158"/>
-      </w:tblGrid>
-      <w:tr>
-        <w:trPr>
-          <w:trHeight w:val="370"/>
-        </w:trPr>
-        <w:tc>
-          <w:tcPr>
-            <w:tcW w:w="10158" w:type="dxa"/>
-            <w:shd w:val="clear" w:color="auto" w:fill="DFDFDF"/>
-            <w:vAlign w:val="center"/>
-          </w:tcPr>
-          <w:p>
-            <w:pPr>
-              <w:pStyle w:val="a3"/>
-              <w:jc w:val="center"/>
-            </w:pPr>
-            <w:r>
-              <w:rPr>
-                <w:rFonts w:ascii="HY중고딕" w:eastAsia="HY중고딕" w:hAnsi="HY중고딕" w:cs="HY중고딕"/>
-                <w:b/>
-                <w:sz w:val="22"/>
-              </w:rPr>
-              <w:t>5. 프로젝트 수행자의 의도</w:t>
-            </w:r>
-          </w:p>
-        </w:tc>
-      </w:tr>
-      <w:tr>
-        <w:tc>
-          <w:tcPr>
-            <w:tcW w:w="10158" w:type="dxa"/>
-            <w:shd w:val="clear" w:color="auto" w:fill="F2F2F2"/>
-          </w:tcPr>
-          <w:p>
-            <w:pPr>
-              <w:pStyle w:val="a3"/>
-              <w:spacing w:line="312" w:lineRule="auto"/>
-              <w:ind w:left="200" w:hanging="200"/>
-            </w:pPr>
-            <w:r>
-              <w:rPr>
-                <w:rFonts w:ascii="HY중고딕" w:eastAsia="HY중고딕" w:hAnsi="HY중고딕" w:cs="HY중고딕"/>
-                <w:sz w:val="21"/>
-              </w:rPr>
-              <w:t>‣ 이 주제로 프로젝트를 수행하고 싶은 이유는 무엇인가?</w:t>
-            </w:r>
-          </w:p>
-          <w:p>
-            <w:pPr>
-              <w:pStyle w:val="a3"/>
-              <w:spacing w:line="312" w:lineRule="auto"/>
-              <w:ind w:left="200" w:hanging="200"/>
-            </w:pPr>
-            <w:r>
-              <w:rPr>
-                <w:rFonts w:ascii="HY중고딕" w:eastAsia="HY중고딕" w:hAnsi="HY중고딕" w:cs="HY중고딕"/>
-                <w:sz w:val="21"/>
-              </w:rPr>
-              <w:t>‣ 이 문제(과제)를 해결하고 싶은 이유는 무엇인가?</w:t>
-            </w:r>
-          </w:p>
-        </w:tc>
-      </w:tr>
-    </w:tbl>
-    <w:p>
-      <w:pPr>
-        <w:pStyle w:val="a3"/>
-      </w:pPr>
-    </w:p>
-    <w:tbl>
-      <w:tblPr>
-        <w:tblW w:w="10158" w:type="dxa"/>
-        <w:tblInd w:w="102" w:type="dxa"/>
-        <w:tblBorders>
-          <w:top w:val="single" w:sz="3" w:space="0" w:color="000000"/>
-          <w:left w:val="single" w:sz="3" w:space="0" w:color="000000"/>
-          <w:bottom w:val="single" w:sz="3" w:space="0" w:color="000000"/>
-          <w:right w:val="single" w:sz="3" w:space="0" w:color="000000"/>
-        </w:tblBorders>
-        <w:tblLayout w:type="fixed"/>
-        <w:tblCellMar>
-          <w:top w:w="57" w:type="dxa"/>
-          <w:left w:w="102" w:type="dxa"/>
-          <w:bottom w:w="57" w:type="dxa"/>
-          <w:right w:w="102" w:type="dxa"/>
-        </w:tblCellMar>
-        <w:tblLook w:val="04A0" w:firstRow="1" w:lastRow="0" w:firstColumn="1" w:lastColumn="0" w:noHBand="0" w:noVBand="1"/>
-      </w:tblPr>
-      <w:tblGrid>
-        <w:gridCol w:w="10158"/>
-      </w:tblGrid>
-      <w:tr>
-        <w:trPr>
-          <w:trHeight w:val="370"/>
-        </w:trPr>
-        <w:tc>
-          <w:tcPr>
-            <w:tcW w:w="10158" w:type="dxa"/>
-            <w:shd w:val="clear" w:color="auto" w:fill="DFDFDF"/>
-            <w:vAlign w:val="center"/>
-          </w:tcPr>
-          <w:p>
-            <w:pPr>
-              <w:pStyle w:val="a3"/>
-              <w:jc w:val="center"/>
-            </w:pPr>
-            <w:r>
-              <w:rPr>
-                <w:rFonts w:ascii="HY중고딕" w:eastAsia="HY중고딕" w:hAnsi="HY중고딕" w:cs="HY중고딕"/>
-                <w:b/>
-                <w:sz w:val="22"/>
-              </w:rPr>
-              <w:t>6. 탐구 내용 및 기대 결과</w:t>
-            </w:r>
-          </w:p>
-        </w:tc>
-      </w:tr>
-      <w:tr>
-        <w:tc>
-          <w:tcPr>
-            <w:tcW w:w="10158" w:type="dxa"/>
-            <w:shd w:val="clear" w:color="auto" w:fill="F2F2F2"/>
-          </w:tcPr>
-          <w:p>
-            <w:pPr>
-              <w:pStyle w:val="a3"/>
-              <w:spacing w:line="312" w:lineRule="auto"/>
-              <w:ind w:left="200" w:hanging="200"/>
-            </w:pPr>
-            <w:r>
-              <w:rPr>
-                <w:rFonts w:ascii="HY중고딕" w:eastAsia="HY중고딕" w:hAnsi="HY중고딕" w:cs="HY중고딕"/>
-                <w:sz w:val="21"/>
-              </w:rPr>
-              <w:t>‣ 프로젝트 기간 동안 문제 해결을 위해 무엇을 시도해보고 싶은가?</w:t>
-            </w:r>
-          </w:p>
-          <w:p>
-            <w:pPr>
-              <w:pStyle w:val="a3"/>
-              <w:spacing w:line="312" w:lineRule="auto"/>
-              <w:ind w:left="200" w:hanging="200"/>
-            </w:pPr>
-            <w:r>
-              <w:rPr>
-                <w:rFonts w:ascii="HY중고딕" w:eastAsia="HY중고딕" w:hAnsi="HY중고딕" w:cs="HY중고딕"/>
-                <w:sz w:val="21"/>
-              </w:rPr>
-              <w:t>‣ 기대하는 결과물은 무엇인가?</w:t>
-            </w:r>
-          </w:p>
-          <w:p>
-            <w:pPr>
-              <w:pStyle w:val="a3"/>
-              <w:spacing w:line="312" w:lineRule="auto"/>
-              <w:ind w:left="200" w:hanging="200"/>
-            </w:pPr>
-            <w:r>
-              <w:rPr>
-                <w:rFonts w:ascii="HY중고딕" w:eastAsia="HY중고딕" w:hAnsi="HY중고딕" w:cs="HY중고딕"/>
-                <w:sz w:val="21"/>
-              </w:rPr>
-              <w:lastRenderedPageBreak/>
-              <w:t>‣ 정량적/정성적 달성 지표는 무엇인가? (현 단계에서는 잠정치로 기재, 4주차 문제정의서에서 확정)</w:t>
-            </w:r>
-          </w:p>
-        </w:tc>
-      </w:tr>
-    </w:tbl>
-    <w:p>
-      <w:pPr>
-        <w:pStyle w:val="a3"/>
-      </w:pPr>
-    </w:p>
-    <w:tbl>
-      <w:tblPr>
-        <w:tblW w:w="10158" w:type="dxa"/>
-        <w:tblInd w:w="102" w:type="dxa"/>
-        <w:tblBorders>
-          <w:top w:val="single" w:sz="3" w:space="0" w:color="000000"/>
-          <w:left w:val="single" w:sz="3" w:space="0" w:color="000000"/>
-          <w:bottom w:val="single" w:sz="3" w:space="0" w:color="000000"/>
-          <w:right w:val="single" w:sz="3" w:space="0" w:color="000000"/>
-        </w:tblBorders>
-        <w:tblLayout w:type="fixed"/>
-        <w:tblCellMar>
-          <w:top w:w="57" w:type="dxa"/>
-          <w:left w:w="102" w:type="dxa"/>
-          <w:bottom w:w="57" w:type="dxa"/>
-          <w:right w:w="102" w:type="dxa"/>
-        </w:tblCellMar>
-        <w:tblLook w:val="04A0" w:firstRow="1" w:lastRow="0" w:firstColumn="1" w:lastColumn="0" w:noHBand="0" w:noVBand="1"/>
-      </w:tblPr>
-      <w:tblGrid>
-        <w:gridCol w:w="10158"/>
-      </w:tblGrid>
-      <w:tr>
-        <w:trPr>
-          <w:trHeight w:val="370"/>
-        </w:trPr>
-        <w:tc>
-          <w:tcPr>
-            <w:tcW w:w="10158" w:type="dxa"/>
-            <w:shd w:val="clear" w:color="auto" w:fill="DFDFDF"/>
-            <w:vAlign w:val="center"/>
-          </w:tcPr>
-          <w:p>
-            <w:pPr>
-              <w:pStyle w:val="a3"/>
-              <w:jc w:val="center"/>
-            </w:pPr>
-            <w:r>
-              <w:rPr>
-                <w:rFonts w:ascii="HY중고딕" w:eastAsia="HY중고딕" w:hAnsi="HY중고딕" w:cs="HY중고딕"/>
-                <w:b/>
-                <w:sz w:val="22"/>
-              </w:rPr>
-              <w:t>7. 프로젝트 관련 학습 계획</w:t>
-            </w:r>
-          </w:p>
-        </w:tc>
-      </w:tr>
-      <w:tr>
-        <w:tc>
-          <w:tcPr>
-            <w:tcW w:w="10158" w:type="dxa"/>
-            <w:shd w:val="clear" w:color="auto" w:fill="F2F2F2"/>
-          </w:tcPr>
-          <w:p>
-            <w:pPr>
-              <w:pStyle w:val="a3"/>
-              <w:spacing w:line="312" w:lineRule="auto"/>
-              <w:ind w:left="200" w:hanging="200"/>
-            </w:pPr>
-            <w:r>
-              <w:rPr>
-                <w:rFonts w:ascii="HY중고딕" w:eastAsia="HY중고딕" w:hAnsi="HY중고딕" w:cs="HY중고딕"/>
-                <w:sz w:val="21"/>
-              </w:rPr>
-              <w:t>‣ 문제 해결에 필요한 기술·도구·도메인 지식을 항목별로 나누어 기재</w:t>
-            </w:r>
-          </w:p>
-          <w:p>
-            <w:pPr>
-              <w:pStyle w:val="a3"/>
-              <w:spacing w:line="312" w:lineRule="auto"/>
-              <w:ind w:left="200" w:hanging="200"/>
-            </w:pPr>
-            <w:r>
-              <w:rPr>
-                <w:rFonts w:ascii="HY중고딕" w:eastAsia="HY중고딕" w:hAnsi="HY중고딕" w:cs="HY중고딕"/>
-                <w:sz w:val="21"/>
-              </w:rPr>
-              <w:t xml:space="preserve">‣ 기간은 주 단위(예: 9월 3주~4주)로 기재하고, 조원별 역할을 분담</w:t>
-            </w:r>
-          </w:p>
-        </w:tc>
-      </w:tr>
-    </w:tbl>
-    <w:p>
-      <w:pPr>
-        <w:pStyle w:val="a3"/>
-      </w:pPr>
-    </w:p>
-    <w:tbl>
-      <w:tblPr>
-        <w:tblW w:w="10158" w:type="dxa"/>
-        <w:tblInd w:w="102" w:type="dxa"/>
-        <w:tblBorders>
-          <w:top w:val="single" w:sz="3" w:space="0" w:color="000000"/>
-          <w:left w:val="single" w:sz="3" w:space="0" w:color="000000"/>
-          <w:bottom w:val="single" w:sz="3" w:space="0" w:color="000000"/>
-          <w:right w:val="single" w:sz="3" w:space="0" w:color="000000"/>
-        </w:tblBorders>
-        <w:tblLayout w:type="fixed"/>
-        <w:tblCellMar>
-          <w:top w:w="57" w:type="dxa"/>
-          <w:left w:w="102" w:type="dxa"/>
-          <w:bottom w:w="57" w:type="dxa"/>
-          <w:right w:w="102" w:type="dxa"/>
-        </w:tblCellMar>
-        <w:tblLook w:val="04A0" w:firstRow="1" w:lastRow="0" w:firstColumn="1" w:lastColumn="0" w:noHBand="0" w:noVBand="1"/>
-      </w:tblPr>
-      <w:tblGrid>
-        <w:gridCol w:w="10158"/>
-      </w:tblGrid>
-      <w:tr>
-        <w:trPr>
-          <w:trHeight w:val="370"/>
-        </w:trPr>
-        <w:tc>
-          <w:tcPr>
-            <w:tcW w:w="10158" w:type="dxa"/>
-            <w:shd w:val="clear" w:color="auto" w:fill="DFDFDF"/>
-            <w:vAlign w:val="center"/>
-          </w:tcPr>
-          <w:p>
-            <w:pPr>
-              <w:pStyle w:val="a3"/>
-              <w:jc w:val="center"/>
-            </w:pPr>
-            <w:r>
-              <w:rPr>
-                <w:rFonts w:ascii="HY중고딕" w:eastAsia="HY중고딕" w:hAnsi="HY중고딕" w:cs="HY중고딕"/>
-                <w:b/>
-                <w:sz w:val="22"/>
-              </w:rPr>
-              <w:t xml:space="preserve">8. 공감 계획 — 현장방문 / 인터뷰 / 관찰 계획</w:t>
-            </w:r>
-          </w:p>
-        </w:tc>
-      </w:tr>
-      <w:tr>
-        <w:tc>
-          <w:tcPr>
-            <w:tcW w:w="10158" w:type="dxa"/>
-            <w:shd w:val="clear" w:color="auto" w:fill="F2F2F2"/>
-          </w:tcPr>
-          <w:p>
-            <w:pPr>
-              <w:pStyle w:val="a3"/>
-              <w:spacing w:line="312" w:lineRule="auto"/>
-              <w:ind w:left="200" w:hanging="200"/>
-            </w:pPr>
-            <w:r>
-              <w:rPr>
-                <w:rFonts w:ascii="HY중고딕" w:eastAsia="HY중고딕" w:hAnsi="HY중고딕" w:cs="HY중고딕"/>
-                <w:sz w:val="21"/>
-              </w:rPr>
-              <w:t>◦ 공감(EMPATHIZE)은 관찰 · 인터뷰 · 직접 체험을 통해 문제 당사자의 관점을 이해하는 과정이다.</w:t>
-            </w:r>
-          </w:p>
-          <w:p>
-            <w:pPr>
-              <w:pStyle w:val="a3"/>
-              <w:spacing w:line="312" w:lineRule="auto"/>
-              <w:ind w:left="200" w:hanging="200"/>
-            </w:pPr>
-            <w:r>
-              <w:rPr>
-                <w:rFonts w:ascii="HY중고딕" w:eastAsia="HY중고딕" w:hAnsi="HY중고딕" w:cs="HY중고딕"/>
-                <w:sz w:val="21"/>
-              </w:rPr>
-              <w:t xml:space="preserve">◦ 관찰 계획: 무엇을 관찰할 것인가 — Activity(행위) / Environment(환경) / Interaction(상호작용) / Objects(사물) / Users(사람)</w:t>
-            </w:r>
-          </w:p>
-          <w:p>
-            <w:pPr>
-              <w:pStyle w:val="a3"/>
-              <w:spacing w:line="312" w:lineRule="auto"/>
-              <w:ind w:left="520" w:hanging="200"/>
-            </w:pPr>
-            <w:r>
-              <w:rPr>
-                <w:rFonts w:ascii="HY중고딕" w:eastAsia="HY중고딕" w:hAnsi="HY중고딕" w:cs="HY중고딕"/>
-                <w:sz w:val="21"/>
-              </w:rPr>
-              <w:t xml:space="preserve">‣ 관찰·쉐도잉은 대상 선정이 관건, 모니터링은 현장 선정이 관건</w:t>
-            </w:r>
-          </w:p>
-          <w:p>
-            <w:pPr>
-              <w:pStyle w:val="a3"/>
-              <w:spacing w:line="312" w:lineRule="auto"/>
-              <w:ind w:left="200" w:hanging="200"/>
-            </w:pPr>
-            <w:r>
-              <w:rPr>
-                <w:rFonts w:ascii="HY중고딕" w:eastAsia="HY중고딕" w:hAnsi="HY중고딕" w:cs="HY중고딕"/>
-                <w:sz w:val="21"/>
-              </w:rPr>
-              <w:t>◦ 인터뷰 계획: 질문은 반드시 미리 준비하고, 역할을 나눈다.</w:t>
-            </w:r>
-          </w:p>
-          <w:p>
-            <w:pPr>
-              <w:pStyle w:val="a3"/>
-              <w:spacing w:line="312" w:lineRule="auto"/>
-              <w:ind w:left="520" w:hanging="200"/>
-            </w:pPr>
-            <w:r>
-              <w:rPr>
-                <w:rFonts w:ascii="HY중고딕" w:eastAsia="HY중고딕" w:hAnsi="HY중고딕" w:cs="HY중고딕"/>
-                <w:sz w:val="21"/>
-              </w:rPr>
-              <w:t xml:space="preserve">‣ 질문자 — 준비한 질문을 하고 즉석 추가 질문을 한다 / 기록자 — 고객의 언어로 그대로 적는다 / 관찰자 — 행동·말투·제스처를 관찰한다</w:t>
-            </w:r>
-          </w:p>
-          <w:p>
-            <w:pPr>
-              <w:pStyle w:val="a3"/>
-              <w:spacing w:line="312" w:lineRule="auto"/>
-              <w:ind w:left="520" w:hanging="200"/>
-            </w:pPr>
-            <w:r>
-              <w:rPr>
-                <w:rFonts w:ascii="HY중고딕" w:eastAsia="HY중고딕" w:hAnsi="HY중고딕" w:cs="HY중고딕"/>
-                <w:sz w:val="21"/>
-              </w:rPr>
-              <w:t>‣ 닫힌 질문(Y/N) 지양 — 열린 질문, 중립적 질문, 긍정적 질문으로 설계</w:t>
-            </w:r>
-          </w:p>
-          <w:p>
-            <w:pPr>
-              <w:pStyle w:val="a3"/>
-              <w:spacing w:line="312" w:lineRule="auto"/>
-              <w:ind w:left="520" w:hanging="200"/>
-            </w:pPr>
-            <w:r>
-              <w:rPr>
-                <w:rFonts w:ascii="HY중고딕" w:eastAsia="HY중고딕" w:hAnsi="HY중고딕" w:cs="HY중고딕"/>
-                <w:sz w:val="21"/>
-              </w:rPr>
-              <w:t>‣ 또 질문(또 어떤 불편이 있나요?), 이유 질문(어떤 이유로 그렇게 느끼셨나요?), 정의 질문, 구체화 질문을 활용</w:t>
-            </w:r>
-          </w:p>
-          <w:p>
-            <w:pPr>
-              <w:pStyle w:val="a3"/>
-              <w:spacing w:line="312" w:lineRule="auto"/>
-              <w:ind w:left="520" w:hanging="200"/>
-            </w:pPr>
-            <w:r>
-              <w:rPr>
-                <w:rFonts w:ascii="HY중고딕" w:eastAsia="HY중고딕" w:hAnsi="HY중고딕" w:cs="HY중고딕"/>
-                <w:sz w:val="21"/>
-              </w:rPr>
-              <w:t>‣ "왜?"는 공격적으로 느껴질 수 있으므로 "어떤 이유로"로 바꾸어 질문</w:t>
-            </w:r>
-          </w:p>
-          <w:p>
-            <w:pPr>
-              <w:pStyle w:val="a3"/>
-              <w:spacing w:line="312" w:lineRule="auto"/>
-              <w:ind w:left="520" w:hanging="200"/>
-            </w:pPr>
-            <w:r>
-              <w:rPr>
-                <w:rFonts w:ascii="HY중고딕" w:eastAsia="HY중고딕" w:hAnsi="HY중고딕" w:cs="HY중고딕"/>
-                <w:sz w:val="21"/>
-              </w:rPr>
-              <w:t>‣ 녹음은 반드시 허락을 받고 진행</w:t>
-            </w:r>
-          </w:p>
-        </w:tc>
-      </w:tr>
-    </w:tbl>
-    <w:p>
-      <w:pPr>
-        <w:pStyle w:val="a3"/>
-      </w:pPr>
-    </w:p>
-    <w:tbl>
-      <w:tblPr>
-        <w:tblW w:w="10158" w:type="dxa"/>
-        <w:tblInd w:w="102" w:type="dxa"/>
-        <w:tblBorders>
-          <w:top w:val="single" w:sz="3" w:space="0" w:color="000000"/>
-          <w:left w:val="single" w:sz="3" w:space="0" w:color="000000"/>
-          <w:bottom w:val="single" w:sz="3" w:space="0" w:color="000000"/>
-          <w:right w:val="single" w:sz="3" w:space="0" w:color="000000"/>
-        </w:tblBorders>
-        <w:tblLayout w:type="fixed"/>
-        <w:tblCellMar>
-          <w:top w:w="57" w:type="dxa"/>
-          <w:left w:w="102" w:type="dxa"/>
-          <w:bottom w:w="57" w:type="dxa"/>
-          <w:right w:w="102" w:type="dxa"/>
-        </w:tblCellMar>
-        <w:tblLook w:val="04A0" w:firstRow="1" w:lastRow="0" w:firstColumn="1" w:lastColumn="0" w:noHBand="0" w:noVBand="1"/>
-      </w:tblPr>
-      <w:tblGrid>
-        <w:gridCol w:w="10158"/>
-      </w:tblGrid>
-      <w:tr>
-        <w:trPr>
-          <w:trHeight w:val="370"/>
-        </w:trPr>
-        <w:tc>
-          <w:tcPr>
-            <w:tcW w:w="10158" w:type="dxa"/>
-            <w:shd w:val="clear" w:color="auto" w:fill="DFDFDF"/>
-            <w:vAlign w:val="center"/>
-          </w:tcPr>
-          <w:p>
-            <w:pPr>
-              <w:pStyle w:val="a3"/>
-              <w:jc w:val="center"/>
-            </w:pPr>
-            <w:r>
-              <w:rPr>
-                <w:rFonts w:ascii="HY중고딕" w:eastAsia="HY중고딕" w:hAnsi="HY중고딕" w:cs="HY중고딕"/>
-                <w:b/>
-                <w:sz w:val="22"/>
-              </w:rPr>
-              <w:t>제출 방법</w:t>
-            </w:r>
-          </w:p>
-        </w:tc>
-      </w:tr>
-      <w:tr>
-        <w:tc>
-          <w:tcPr>
-            <w:tcW w:w="10158" w:type="dxa"/>
-            <w:shd w:val="clear" w:color="auto" w:fill="F2F2F2"/>
-          </w:tcPr>
-          <w:p>
-            <w:pPr>
-              <w:pStyle w:val="a3"/>
-              <w:spacing w:line="312" w:lineRule="auto"/>
-              <w:ind w:left="200" w:hanging="200"/>
-              <w:rPr>
-                <w:rFonts w:ascii="HY중고딕" w:eastAsia="HY중고딕" w:hAnsi="HY중고딕" w:cs="HY중고딕"/>
-                <w:sz w:val="21"/>
-              </w:rPr>
-            </w:pPr>
-            <w:r>
-              <w:rPr>
-                <w:rFonts w:ascii="HY중고딕" w:eastAsia="HY중고딕" w:hAnsi="HY중고딕" w:cs="HY중고딕"/>
-                <w:sz w:val="21"/>
-              </w:rPr>
-              <w:t xml:space="preserve">‣ </w:t>
-            </w:r>
-            <w:r>
-              <w:rPr>
-                <w:rFonts w:ascii="HY중고딕" w:eastAsia="HY중고딕" w:hAnsi="HY중고딕" w:cs="HY중고딕" w:hint="eastAsia"/>
-                <w:sz w:val="21"/>
-              </w:rPr>
-              <w:t>과제물은 사이버캠퍼스를 통하여 제출한다.</w:t>
-            </w:r>
-          </w:p>
-          <w:p>
-            <w:pPr>
-              <w:pStyle w:val="a3"/>
-              <w:spacing w:line="312" w:lineRule="auto"/>
-              <w:ind w:left="200" w:hanging="200"/>
-            </w:pPr>
-            <w:r>
-              <w:rPr>
-                <w:rFonts w:ascii="HY중고딕" w:eastAsia="HY중고딕" w:hAnsi="HY중고딕" w:cs="HY중고딕"/>
-                <w:sz w:val="21"/>
-              </w:rPr>
-              <w:t xml:space="preserve">‣ </w:t>
-            </w:r>
-            <w:r>
-              <w:rPr>
-                <w:rFonts w:ascii="HY중고딕" w:eastAsia="HY중고딕" w:hAnsi="HY중고딕" w:cs="HY중고딕" w:hint="eastAsia"/>
-                <w:sz w:val="21"/>
-              </w:rPr>
-              <w:t xml:space="preserve">각 팀별로 생성하는 </w:t>
-            </w:r>
-            <w:r>
-              <w:rPr>
-                <w:rFonts w:ascii="HY중고딕" w:eastAsia="HY중고딕" w:hAnsi="HY중고딕" w:cs="HY중고딕"/>
-                <w:sz w:val="21"/>
-              </w:rPr>
-              <w:t xml:space="preserve">모든 문서와 결과물은 GitHub를 통하여 </w:t>
-            </w:r>
-            <w:r>
-              <w:rPr>
-                <w:rFonts w:ascii="HY중고딕" w:eastAsia="HY중고딕" w:hAnsi="HY중고딕" w:cs="HY중고딕" w:hint="eastAsia"/>
-                <w:sz w:val="21"/>
-              </w:rPr>
-              <w:t xml:space="preserve">자율적으로 </w:t>
-            </w:r>
-            <w:r>
-              <w:rPr>
-                <w:rFonts w:ascii="HY중고딕" w:eastAsia="HY중고딕" w:hAnsi="HY중고딕" w:cs="HY중고딕"/>
-                <w:sz w:val="21"/>
-              </w:rPr>
-              <w:t>관리한다.</w:t>
-            </w:r>
-          </w:p>
-          <w:p>
-            <w:pPr>
-              <w:pStyle w:val="a3"/>
-              <w:spacing w:line="312" w:lineRule="auto"/>
-              <w:ind w:left="200" w:hanging="200"/>
-            </w:pPr>
-            <w:r>
-              <w:rPr>
-                <w:rFonts w:ascii="HY중고딕" w:eastAsia="HY중고딕" w:hAnsi="HY중고딕" w:cs="HY중고딕"/>
-                <w:sz w:val="21"/>
-              </w:rPr>
-              <w:t>‣ 제출 전 자가점검 체크리스트를 확인하고, 본 가이드 페이지를 삭제한다.</w:t>
-            </w:r>
-          </w:p>
-        </w:tc>
-      </w:tr>
-    </w:tbl>
-    <w:p>
-      <w:pPr>
-        <w:pStyle w:val="a3"/>
-      </w:pPr>
     </w:p>
     <w:sectPr>
       <w:footerReference w:type="default" r:id="rId7"/>
@@ -4560,7 +4090,7 @@
         <w:color w:val="595959"/>
         <w:sz w:val="18"/>
       </w:rPr>
-      <w:t xml:space="preserve">AI활용현업문제해결 </w:t>
+      <w:t>AI활용현업문제해결</w:t>
     </w:r>
     <w:proofErr w:type="gramStart"/>
     <w:r>
@@ -4569,7 +4099,7 @@
         <w:color w:val="595959"/>
         <w:sz w:val="18"/>
       </w:rPr>
-      <w:t>  ·</w:t>
+      <w:t xml:space="preserve">  ·</w:t>
     </w:r>
     <w:proofErr w:type="gramEnd"/>
     <w:r>

</xml_diff>